<commit_message>
se agregan cambios al archivo
</commit_message>
<xml_diff>
--- a/Actividad 2 - Prototipo del Proyecto.docx
+++ b/Actividad 2 - Prototipo del Proyecto.docx
@@ -108,7 +108,7 @@
           <w:lang w:val="es-CO"/>
         </w:rPr>
         <w:drawing>
-          <wp:anchor distT="0" distB="0" distL="0" distR="0" simplePos="0" relativeHeight="251466240" behindDoc="0" locked="0" layoutInCell="0" allowOverlap="1" wp14:anchorId="74C1506F" wp14:editId="46289549">
+          <wp:anchor distT="0" distB="0" distL="0" distR="0" simplePos="0" relativeHeight="251643392" behindDoc="0" locked="0" layoutInCell="0" allowOverlap="1" wp14:anchorId="74C1506F" wp14:editId="46289549">
             <wp:simplePos x="0" y="0"/>
             <wp:positionH relativeFrom="column">
               <wp:posOffset>1684655</wp:posOffset>
@@ -429,6 +429,13 @@
     </w:p>
     <w:sdt>
       <w:sdtPr>
+        <w:rPr>
+          <w:rFonts w:ascii="Times New Roman" w:hAnsi="Times New Roman"/>
+          <w:b w:val="0"/>
+          <w:bCs w:val="0"/>
+          <w:sz w:val="24"/>
+          <w:szCs w:val="24"/>
+        </w:rPr>
         <w:id w:val="2074924775"/>
         <w:docPartObj>
           <w:docPartGallery w:val="Table of Contents"/>
@@ -437,7 +444,6 @@
       </w:sdtPr>
       <w:sdtEndPr>
         <w:rPr>
-          <w:rFonts w:ascii="Times New Roman" w:hAnsi="Times New Roman"/>
           <w:sz w:val="22"/>
           <w:szCs w:val="22"/>
         </w:rPr>
@@ -515,23 +521,7 @@
             <w:jc w:val="both"/>
           </w:pPr>
           <w:r>
-            <w:t xml:space="preserve">1.1 </w:t>
-          </w:r>
-          <w:proofErr w:type="spellStart"/>
-          <w:r>
-            <w:t>Descripción</w:t>
-          </w:r>
-          <w:proofErr w:type="spellEnd"/>
-          <w:r>
-            <w:t xml:space="preserve"> general de la </w:t>
-          </w:r>
-          <w:proofErr w:type="spellStart"/>
-          <w:r>
-            <w:t>línea</w:t>
-          </w:r>
-          <w:proofErr w:type="spellEnd"/>
-          <w:r>
-            <w:t xml:space="preserve"> seleccionada</w:t>
+            <w:t>1.1 Descripción general de la línea seleccionada</w:t>
           </w:r>
           <w:hyperlink w:anchor="_Toc62801090">
             <w:r>
@@ -555,15 +545,7 @@
             <w:jc w:val="both"/>
           </w:pPr>
           <w:r>
-            <w:t xml:space="preserve">1.2 </w:t>
-          </w:r>
-          <w:proofErr w:type="spellStart"/>
-          <w:r>
-            <w:t>Justificación</w:t>
-          </w:r>
-          <w:proofErr w:type="spellEnd"/>
-          <w:r>
-            <w:t xml:space="preserve"> de la elección</w:t>
+            <w:t>1.2 Justificación de la elección</w:t>
           </w:r>
           <w:hyperlink w:anchor="_Toc62801090">
             <w:r>
@@ -587,31 +569,7 @@
             <w:jc w:val="both"/>
           </w:pPr>
           <w:r>
-            <w:t xml:space="preserve">1.3 </w:t>
-          </w:r>
-          <w:proofErr w:type="spellStart"/>
-          <w:r>
-            <w:t>Conformación</w:t>
-          </w:r>
-          <w:proofErr w:type="spellEnd"/>
-          <w:r>
-            <w:t xml:space="preserve"> del </w:t>
-          </w:r>
-          <w:proofErr w:type="spellStart"/>
-          <w:r>
-            <w:t>equipo</w:t>
-          </w:r>
-          <w:proofErr w:type="spellEnd"/>
-          <w:r>
-            <w:t xml:space="preserve"> de </w:t>
-          </w:r>
-          <w:proofErr w:type="spellStart"/>
-          <w:r>
-            <w:t>trabajo</w:t>
-          </w:r>
-          <w:proofErr w:type="spellEnd"/>
-          <w:r>
-            <w:t xml:space="preserve"> </w:t>
+            <w:t xml:space="preserve">1.3 Conformación del equipo de trabajo </w:t>
           </w:r>
           <w:hyperlink w:anchor="_Toc62801090">
             <w:r>
@@ -669,23 +627,7 @@
             <w:jc w:val="both"/>
           </w:pPr>
           <w:r>
-            <w:t xml:space="preserve">2.1 </w:t>
-          </w:r>
-          <w:proofErr w:type="spellStart"/>
-          <w:r>
-            <w:t>Descripción</w:t>
-          </w:r>
-          <w:proofErr w:type="spellEnd"/>
-          <w:r>
-            <w:t xml:space="preserve"> del CVDS </w:t>
-          </w:r>
-          <w:proofErr w:type="spellStart"/>
-          <w:r>
-            <w:t>aplicado</w:t>
-          </w:r>
-          <w:proofErr w:type="spellEnd"/>
-          <w:r>
-            <w:t xml:space="preserve"> al proyecto</w:t>
+            <w:t>2.1 Descripción del CVDS aplicado al proyecto</w:t>
           </w:r>
           <w:hyperlink w:anchor="_Toc62801090">
             <w:r>
@@ -767,23 +709,7 @@
             <w:jc w:val="both"/>
           </w:pPr>
           <w:r>
-            <w:t xml:space="preserve">3.1 </w:t>
-          </w:r>
-          <w:proofErr w:type="spellStart"/>
-          <w:r>
-            <w:t>Justificación</w:t>
-          </w:r>
-          <w:proofErr w:type="spellEnd"/>
-          <w:r>
-            <w:t xml:space="preserve"> de la </w:t>
-          </w:r>
-          <w:proofErr w:type="spellStart"/>
-          <w:r>
-            <w:t>metodología</w:t>
-          </w:r>
-          <w:proofErr w:type="spellEnd"/>
-          <w:r>
-            <w:t xml:space="preserve"> seleccionada</w:t>
+            <w:t>3.1 Justificación de la metodología seleccionada</w:t>
           </w:r>
           <w:hyperlink w:anchor="_Toc62801090">
             <w:r>
@@ -807,23 +733,7 @@
             <w:jc w:val="both"/>
           </w:pPr>
           <w:r>
-            <w:t xml:space="preserve">3.2 </w:t>
-          </w:r>
-          <w:proofErr w:type="spellStart"/>
-          <w:r>
-            <w:t>Tablero</w:t>
-          </w:r>
-          <w:proofErr w:type="spellEnd"/>
-          <w:r>
-            <w:t xml:space="preserve"> de </w:t>
-          </w:r>
-          <w:proofErr w:type="spellStart"/>
-          <w:r>
-            <w:t>gestión</w:t>
-          </w:r>
-          <w:proofErr w:type="spellEnd"/>
-          <w:r>
-            <w:t xml:space="preserve"> del proyecto</w:t>
+            <w:t>3.2 Tablero de gestión del proyecto</w:t>
           </w:r>
           <w:hyperlink w:anchor="_Toc62801090">
             <w:r>
@@ -847,23 +757,7 @@
             <w:jc w:val="both"/>
           </w:pPr>
           <w:r>
-            <w:t xml:space="preserve">3.3 Organización </w:t>
-          </w:r>
-          <w:proofErr w:type="spellStart"/>
-          <w:r>
-            <w:t>por</w:t>
-          </w:r>
-          <w:proofErr w:type="spellEnd"/>
-          <w:r>
-            <w:t xml:space="preserve"> sprints o </w:t>
-          </w:r>
-          <w:proofErr w:type="spellStart"/>
-          <w:r>
-            <w:t>fases</w:t>
-          </w:r>
-          <w:proofErr w:type="spellEnd"/>
-          <w:r>
-            <w:t xml:space="preserve"> ágiles</w:t>
+            <w:t>3.3 Organización por sprints o fases ágiles</w:t>
           </w:r>
           <w:hyperlink w:anchor="_Toc62801090">
             <w:r>
@@ -887,15 +781,7 @@
             <w:jc w:val="both"/>
           </w:pPr>
           <w:r>
-            <w:t xml:space="preserve">4. Design Thinking e </w:t>
-          </w:r>
-          <w:proofErr w:type="spellStart"/>
-          <w:r>
-            <w:t>investigación</w:t>
-          </w:r>
-          <w:proofErr w:type="spellEnd"/>
-          <w:r>
-            <w:t xml:space="preserve"> con usuarios</w:t>
+            <w:t>4. Design Thinking e investigación con usuarios</w:t>
           </w:r>
           <w:hyperlink w:anchor="_Toc62801089">
             <w:r>
@@ -919,23 +805,7 @@
             <w:jc w:val="both"/>
           </w:pPr>
           <w:r>
-            <w:t xml:space="preserve">4.1 </w:t>
-          </w:r>
-          <w:proofErr w:type="spellStart"/>
-          <w:r>
-            <w:t>Proceso</w:t>
-          </w:r>
-          <w:proofErr w:type="spellEnd"/>
-          <w:r>
-            <w:t xml:space="preserve"> de </w:t>
-          </w:r>
-          <w:proofErr w:type="spellStart"/>
-          <w:r>
-            <w:t>investigación</w:t>
-          </w:r>
-          <w:proofErr w:type="spellEnd"/>
-          <w:r>
-            <w:t xml:space="preserve"> con usuarios</w:t>
+            <w:t>4.1 Proceso de investigación con usuarios</w:t>
           </w:r>
           <w:hyperlink w:anchor="_Toc62801090">
             <w:r>
@@ -1055,23 +925,7 @@
             <w:jc w:val="both"/>
           </w:pPr>
           <w:r>
-            <w:t xml:space="preserve">4.5 </w:t>
-          </w:r>
-          <w:proofErr w:type="spellStart"/>
-          <w:r>
-            <w:t>Ideación</w:t>
-          </w:r>
-          <w:proofErr w:type="spellEnd"/>
-          <w:r>
-            <w:t xml:space="preserve"> y </w:t>
-          </w:r>
-          <w:proofErr w:type="spellStart"/>
-          <w:r>
-            <w:t>propuesta</w:t>
-          </w:r>
-          <w:proofErr w:type="spellEnd"/>
-          <w:r>
-            <w:t xml:space="preserve"> de solución</w:t>
+            <w:t>4.5 Ideación y propuesta de solución</w:t>
           </w:r>
           <w:hyperlink w:anchor="_Toc62801090">
             <w:r>
@@ -1263,31 +1117,7 @@
             <w:jc w:val="both"/>
           </w:pPr>
           <w:r>
-            <w:t xml:space="preserve">6.2 </w:t>
-          </w:r>
-          <w:proofErr w:type="spellStart"/>
-          <w:r>
-            <w:t>definicion</w:t>
-          </w:r>
-          <w:proofErr w:type="spellEnd"/>
-          <w:r>
-            <w:t xml:space="preserve"> de </w:t>
-          </w:r>
-          <w:proofErr w:type="spellStart"/>
-          <w:r>
-            <w:t>el</w:t>
-          </w:r>
-          <w:proofErr w:type="spellEnd"/>
-          <w:r>
-            <w:t xml:space="preserve"> </w:t>
-          </w:r>
-          <w:proofErr w:type="spellStart"/>
-          <w:r>
-            <w:t>alcance</w:t>
-          </w:r>
-          <w:proofErr w:type="spellEnd"/>
-          <w:r>
-            <w:t xml:space="preserve"> y mvp</w:t>
+            <w:t>6.2 definicion de el alcance y mvp</w:t>
           </w:r>
           <w:hyperlink w:anchor="_Toc62801090">
             <w:r>
@@ -1311,15 +1141,7 @@
             <w:jc w:val="both"/>
           </w:pPr>
           <w:r>
-            <w:t xml:space="preserve">6.3 </w:t>
-          </w:r>
-          <w:proofErr w:type="spellStart"/>
-          <w:r>
-            <w:t>planificacion</w:t>
-          </w:r>
-          <w:proofErr w:type="spellEnd"/>
-          <w:r>
-            <w:t xml:space="preserve"> del primer sprint</w:t>
+            <w:t>6.3 planificacion del primer sprint</w:t>
           </w:r>
           <w:hyperlink w:anchor="_Toc62801090">
             <w:r>
@@ -1377,21 +1199,7 @@
             <w:rPr>
               <w:lang w:val="es-CO"/>
             </w:rPr>
-            <w:t xml:space="preserve">7.1 </w:t>
-          </w:r>
-          <w:proofErr w:type="spellStart"/>
-          <w:r>
-            <w:rPr>
-              <w:lang w:val="es-CO"/>
-            </w:rPr>
-            <w:t>Url</w:t>
-          </w:r>
-          <w:proofErr w:type="spellEnd"/>
-          <w:r>
-            <w:rPr>
-              <w:lang w:val="es-CO"/>
-            </w:rPr>
-            <w:t xml:space="preserve"> Requisitos Funcionales</w:t>
+            <w:t>7.1 Url Requisitos Funcionales</w:t>
           </w:r>
           <w:hyperlink w:anchor="_Toc62801090">
             <w:r>
@@ -1419,23 +1227,7 @@
             <w:jc w:val="both"/>
           </w:pPr>
           <w:r>
-            <w:t xml:space="preserve">7.2 </w:t>
-          </w:r>
-          <w:proofErr w:type="spellStart"/>
-          <w:r>
-            <w:t>Url</w:t>
-          </w:r>
-          <w:proofErr w:type="spellEnd"/>
-          <w:r>
-            <w:t xml:space="preserve"> </w:t>
-          </w:r>
-          <w:proofErr w:type="spellStart"/>
-          <w:r>
-            <w:t>Requisitos</w:t>
-          </w:r>
-          <w:proofErr w:type="spellEnd"/>
-          <w:r>
-            <w:t xml:space="preserve"> No Funcionales</w:t>
+            <w:t>7.2 Url Requisitos No Funcionales</w:t>
           </w:r>
           <w:hyperlink w:anchor="_Toc62801090">
             <w:r>
@@ -1459,23 +1251,7 @@
             <w:jc w:val="both"/>
           </w:pPr>
           <w:r>
-            <w:t xml:space="preserve">7.3 </w:t>
-          </w:r>
-          <w:proofErr w:type="spellStart"/>
-          <w:r>
-            <w:t>Historias</w:t>
-          </w:r>
-          <w:proofErr w:type="spellEnd"/>
-          <w:r>
-            <w:t xml:space="preserve"> de </w:t>
-          </w:r>
-          <w:proofErr w:type="spellStart"/>
-          <w:r>
-            <w:t>usuario</w:t>
-          </w:r>
-          <w:proofErr w:type="spellEnd"/>
-          <w:r>
-            <w:t xml:space="preserve"> del MVP</w:t>
+            <w:t>7.3 Historias de usuario del MVP</w:t>
           </w:r>
           <w:hyperlink w:anchor="_Toc62801090">
             <w:r>
@@ -1500,7 +1276,7 @@
           </w:pPr>
           <w:r>
             <w:lastRenderedPageBreak/>
-            <w:t xml:space="preserve">7.3.1 </w:t>
+            <w:t xml:space="preserve">7.4 </w:t>
           </w:r>
           <w:proofErr w:type="spellStart"/>
           <w:r>
@@ -1512,11 +1288,11 @@
           </w:r>
           <w:proofErr w:type="spellStart"/>
           <w:r>
-            <w:t>Criterios</w:t>
+            <w:t>Diagrama</w:t>
           </w:r>
           <w:proofErr w:type="spellEnd"/>
           <w:r>
-            <w:t xml:space="preserve"> de aceptación</w:t>
+            <w:t xml:space="preserve"> de flujo de la solución web </w:t>
           </w:r>
           <w:hyperlink w:anchor="_Toc62801090">
             <w:r>
@@ -1540,7 +1316,7 @@
             <w:jc w:val="both"/>
           </w:pPr>
           <w:r>
-            <w:t xml:space="preserve">7.4 </w:t>
+            <w:t xml:space="preserve">7.3.1 </w:t>
           </w:r>
           <w:proofErr w:type="spellStart"/>
           <w:r>
@@ -1552,27 +1328,11 @@
           </w:r>
           <w:proofErr w:type="spellStart"/>
           <w:r>
-            <w:t>Diagrama</w:t>
+            <w:t>Criterios</w:t>
           </w:r>
           <w:proofErr w:type="spellEnd"/>
           <w:r>
-            <w:t xml:space="preserve"> de </w:t>
-          </w:r>
-          <w:proofErr w:type="spellStart"/>
-          <w:r>
-            <w:t>flujo</w:t>
-          </w:r>
-          <w:proofErr w:type="spellEnd"/>
-          <w:r>
-            <w:t xml:space="preserve"> de la </w:t>
-          </w:r>
-          <w:proofErr w:type="spellStart"/>
-          <w:r>
-            <w:t>solución</w:t>
-          </w:r>
-          <w:proofErr w:type="spellEnd"/>
-          <w:r>
-            <w:t xml:space="preserve"> web </w:t>
+            <w:t xml:space="preserve"> de aceptación</w:t>
           </w:r>
           <w:hyperlink w:anchor="_Toc62801090">
             <w:r>
@@ -1633,15 +1393,7 @@
             </w:rPr>
           </w:pPr>
           <w:r>
-            <w:t xml:space="preserve">9. </w:t>
-          </w:r>
-          <w:proofErr w:type="spellStart"/>
-          <w:r>
-            <w:t>Anexos</w:t>
-          </w:r>
-          <w:proofErr w:type="spellEnd"/>
-          <w:r>
-            <w:t xml:space="preserve"> </w:t>
+            <w:t xml:space="preserve">9. Anexos </w:t>
           </w:r>
           <w:hyperlink w:anchor="_Toc62801091">
             <w:r>
@@ -1684,6 +1436,562 @@
           </w:r>
           <w:r>
             <w:fldChar w:fldCharType="end"/>
+          </w:r>
+        </w:p>
+        <w:p>
+          <w:pPr>
+            <w:pStyle w:val="TDC2"/>
+            <w:tabs>
+              <w:tab w:val="right" w:leader="dot" w:pos="9009"/>
+            </w:tabs>
+            <w:jc w:val="both"/>
+          </w:pPr>
+          <w:r>
+            <w:t>10</w:t>
+          </w:r>
+          <w:r>
+            <w:t>.</w:t>
+          </w:r>
+          <w:r>
+            <w:t>1</w:t>
+          </w:r>
+          <w:r>
+            <w:t xml:space="preserve"> </w:t>
+          </w:r>
+          <w:r>
+            <w:t>cover</w:t>
+          </w:r>
+          <w:hyperlink w:anchor="_Toc62801090">
+            <w:r>
+              <w:rPr>
+                <w:rStyle w:val="Enlacedelndice"/>
+                <w:webHidden/>
+              </w:rPr>
+              <w:tab/>
+            </w:r>
+          </w:hyperlink>
+          <w:r>
+            <w:t>16</w:t>
+          </w:r>
+        </w:p>
+        <w:p>
+          <w:pPr>
+            <w:pStyle w:val="TDC2"/>
+            <w:tabs>
+              <w:tab w:val="right" w:leader="dot" w:pos="9009"/>
+            </w:tabs>
+            <w:jc w:val="both"/>
+          </w:pPr>
+          <w:r>
+            <w:t>10.2 tokens</w:t>
+          </w:r>
+          <w:hyperlink w:anchor="_Toc62801090">
+            <w:r>
+              <w:rPr>
+                <w:rStyle w:val="Enlacedelndice"/>
+                <w:webHidden/>
+              </w:rPr>
+              <w:tab/>
+            </w:r>
+          </w:hyperlink>
+          <w:r>
+            <w:t>16</w:t>
+          </w:r>
+        </w:p>
+        <w:p>
+          <w:pPr>
+            <w:pStyle w:val="TDC2"/>
+            <w:tabs>
+              <w:tab w:val="right" w:leader="dot" w:pos="9009"/>
+            </w:tabs>
+            <w:jc w:val="both"/>
+          </w:pPr>
+          <w:r>
+            <w:t>10.3 components</w:t>
+          </w:r>
+          <w:r>
+            <w:t xml:space="preserve"> </w:t>
+          </w:r>
+          <w:hyperlink w:anchor="_Toc62801090">
+            <w:r>
+              <w:rPr>
+                <w:rStyle w:val="Enlacedelndice"/>
+                <w:webHidden/>
+              </w:rPr>
+              <w:tab/>
+            </w:r>
+          </w:hyperlink>
+          <w:r>
+            <w:t>16</w:t>
+          </w:r>
+        </w:p>
+        <w:p>
+          <w:pPr>
+            <w:pStyle w:val="TDC2"/>
+            <w:tabs>
+              <w:tab w:val="right" w:leader="dot" w:pos="9009"/>
+            </w:tabs>
+            <w:jc w:val="both"/>
+          </w:pPr>
+          <w:r>
+            <w:t>10.4</w:t>
+          </w:r>
+          <w:r>
+            <w:t xml:space="preserve"> </w:t>
+          </w:r>
+          <w:r>
+            <w:t>typography</w:t>
+          </w:r>
+          <w:hyperlink w:anchor="_Toc62801090">
+            <w:r>
+              <w:rPr>
+                <w:rStyle w:val="Enlacedelndice"/>
+                <w:webHidden/>
+              </w:rPr>
+              <w:tab/>
+            </w:r>
+          </w:hyperlink>
+          <w:r>
+            <w:t>16</w:t>
+          </w:r>
+        </w:p>
+        <w:p>
+          <w:pPr>
+            <w:pStyle w:val="TDC2"/>
+            <w:tabs>
+              <w:tab w:val="right" w:leader="dot" w:pos="9009"/>
+            </w:tabs>
+            <w:ind w:left="0"/>
+            <w:jc w:val="both"/>
+          </w:pPr>
+          <w:r>
+            <w:rPr>
+              <w:b/>
+              <w:bCs/>
+              <w:sz w:val="22"/>
+              <w:szCs w:val="22"/>
+              <w:lang w:val="es-CO"/>
+            </w:rPr>
+            <w:t>11.</w:t>
+          </w:r>
+          <w:r>
+            <w:rPr>
+              <w:b/>
+              <w:bCs/>
+              <w:sz w:val="22"/>
+              <w:szCs w:val="22"/>
+              <w:lang w:val="es-CO"/>
+            </w:rPr>
+            <w:t xml:space="preserve">lo fi </w:t>
+          </w:r>
+          <w:proofErr w:type="spellStart"/>
+          <w:r>
+            <w:rPr>
+              <w:b/>
+              <w:bCs/>
+              <w:sz w:val="22"/>
+              <w:szCs w:val="22"/>
+              <w:lang w:val="es-CO"/>
+            </w:rPr>
+            <w:t>wifremes</w:t>
+          </w:r>
+          <w:proofErr w:type="spellEnd"/>
+          <w:r>
+            <w:t xml:space="preserve"> </w:t>
+          </w:r>
+          <w:r>
+            <w:t xml:space="preserve"> </w:t>
+          </w:r>
+          <w:hyperlink w:anchor="_Toc62801090">
+            <w:r>
+              <w:rPr>
+                <w:rStyle w:val="Enlacedelndice"/>
+                <w:webHidden/>
+              </w:rPr>
+              <w:tab/>
+            </w:r>
+          </w:hyperlink>
+          <w:r>
+            <w:t>16</w:t>
+          </w:r>
+        </w:p>
+        <w:p>
+          <w:pPr>
+            <w:pStyle w:val="TDC2"/>
+            <w:tabs>
+              <w:tab w:val="right" w:leader="dot" w:pos="9009"/>
+            </w:tabs>
+            <w:jc w:val="both"/>
+          </w:pPr>
+          <w:r>
+            <w:t>11</w:t>
+          </w:r>
+          <w:r>
+            <w:t>.</w:t>
+          </w:r>
+          <w:r>
+            <w:t>1</w:t>
+          </w:r>
+          <w:r>
+            <w:t xml:space="preserve"> </w:t>
+          </w:r>
+          <w:r>
+            <w:t xml:space="preserve">lo – fi </w:t>
+          </w:r>
+          <w:r>
+            <w:t>login</w:t>
+          </w:r>
+          <w:hyperlink w:anchor="_Toc62801090">
+            <w:r>
+              <w:rPr>
+                <w:rStyle w:val="Enlacedelndice"/>
+                <w:webHidden/>
+              </w:rPr>
+              <w:tab/>
+            </w:r>
+          </w:hyperlink>
+          <w:r>
+            <w:t>16</w:t>
+          </w:r>
+        </w:p>
+        <w:p>
+          <w:pPr>
+            <w:pStyle w:val="TDC2"/>
+            <w:tabs>
+              <w:tab w:val="right" w:leader="dot" w:pos="9009"/>
+            </w:tabs>
+            <w:jc w:val="both"/>
+          </w:pPr>
+          <w:r>
+            <w:t>11.2</w:t>
+          </w:r>
+          <w:r>
+            <w:t xml:space="preserve"> </w:t>
+          </w:r>
+          <w:r>
+            <w:t xml:space="preserve">lo – fi </w:t>
+          </w:r>
+          <w:proofErr w:type="spellStart"/>
+          <w:r>
+            <w:t>registro</w:t>
+          </w:r>
+          <w:proofErr w:type="spellEnd"/>
+          <w:r>
+            <w:t xml:space="preserve"> </w:t>
+          </w:r>
+          <w:hyperlink w:anchor="_Toc62801090">
+            <w:r>
+              <w:rPr>
+                <w:rStyle w:val="Enlacedelndice"/>
+                <w:webHidden/>
+              </w:rPr>
+              <w:tab/>
+            </w:r>
+          </w:hyperlink>
+          <w:r>
+            <w:t>16</w:t>
+          </w:r>
+        </w:p>
+        <w:p>
+          <w:pPr>
+            <w:pStyle w:val="TDC2"/>
+            <w:tabs>
+              <w:tab w:val="right" w:leader="dot" w:pos="9009"/>
+            </w:tabs>
+            <w:jc w:val="both"/>
+          </w:pPr>
+          <w:r>
+            <w:t>11</w:t>
+          </w:r>
+          <w:r>
+            <w:t>.</w:t>
+          </w:r>
+          <w:r>
+            <w:t>3</w:t>
+          </w:r>
+          <w:r>
+            <w:t xml:space="preserve"> </w:t>
+          </w:r>
+          <w:r>
+            <w:t xml:space="preserve">lo – fi home page </w:t>
+          </w:r>
+          <w:r>
+            <w:t xml:space="preserve"> </w:t>
+          </w:r>
+          <w:hyperlink w:anchor="_Toc62801090">
+            <w:r>
+              <w:rPr>
+                <w:rStyle w:val="Enlacedelndice"/>
+                <w:webHidden/>
+              </w:rPr>
+              <w:tab/>
+            </w:r>
+          </w:hyperlink>
+          <w:r>
+            <w:t>16</w:t>
+          </w:r>
+        </w:p>
+        <w:p>
+          <w:pPr>
+            <w:pStyle w:val="TDC2"/>
+            <w:tabs>
+              <w:tab w:val="right" w:leader="dot" w:pos="9009"/>
+            </w:tabs>
+            <w:jc w:val="both"/>
+          </w:pPr>
+          <w:r>
+            <w:t>11.</w:t>
+          </w:r>
+          <w:r>
+            <w:t xml:space="preserve">.4 </w:t>
+          </w:r>
+          <w:r>
+            <w:t xml:space="preserve">lo – fi </w:t>
+          </w:r>
+          <w:proofErr w:type="spellStart"/>
+          <w:r>
+            <w:t>detalles</w:t>
+          </w:r>
+          <w:proofErr w:type="spellEnd"/>
+          <w:r>
+            <w:t xml:space="preserve"> del </w:t>
+          </w:r>
+          <w:proofErr w:type="spellStart"/>
+          <w:r>
+            <w:t>curso</w:t>
+          </w:r>
+          <w:proofErr w:type="spellEnd"/>
+          <w:r>
+            <w:t xml:space="preserve"> </w:t>
+          </w:r>
+          <w:r>
+            <w:t xml:space="preserve"> </w:t>
+          </w:r>
+          <w:hyperlink w:anchor="_Toc62801090">
+            <w:r>
+              <w:rPr>
+                <w:rStyle w:val="Enlacedelndice"/>
+                <w:webHidden/>
+              </w:rPr>
+              <w:tab/>
+            </w:r>
+          </w:hyperlink>
+          <w:r>
+            <w:t>16</w:t>
+          </w:r>
+        </w:p>
+        <w:p>
+          <w:pPr>
+            <w:pStyle w:val="TDC2"/>
+            <w:tabs>
+              <w:tab w:val="right" w:leader="dot" w:pos="9009"/>
+            </w:tabs>
+            <w:jc w:val="both"/>
+          </w:pPr>
+          <w:r>
+            <w:t>11</w:t>
+          </w:r>
+          <w:r>
+            <w:t>.</w:t>
+          </w:r>
+          <w:r>
+            <w:t>5</w:t>
+          </w:r>
+          <w:r>
+            <w:t xml:space="preserve"> </w:t>
+          </w:r>
+          <w:r>
+            <w:t xml:space="preserve">lo – fi </w:t>
+          </w:r>
+          <w:proofErr w:type="spellStart"/>
+          <w:r>
+            <w:t>crear</w:t>
+          </w:r>
+          <w:proofErr w:type="spellEnd"/>
+          <w:r>
+            <w:t xml:space="preserve"> </w:t>
+          </w:r>
+          <w:proofErr w:type="spellStart"/>
+          <w:r>
+            <w:t>actividades</w:t>
+          </w:r>
+          <w:proofErr w:type="spellEnd"/>
+          <w:r>
+            <w:t xml:space="preserve"> </w:t>
+          </w:r>
+          <w:hyperlink w:anchor="_Toc62801090">
+            <w:r>
+              <w:rPr>
+                <w:rStyle w:val="Enlacedelndice"/>
+                <w:webHidden/>
+              </w:rPr>
+              <w:tab/>
+            </w:r>
+          </w:hyperlink>
+          <w:r>
+            <w:t>16</w:t>
+          </w:r>
+        </w:p>
+        <w:p>
+          <w:pPr>
+            <w:pStyle w:val="TDC2"/>
+            <w:tabs>
+              <w:tab w:val="right" w:leader="dot" w:pos="9009"/>
+            </w:tabs>
+            <w:jc w:val="both"/>
+          </w:pPr>
+          <w:r>
+            <w:t>11.</w:t>
+          </w:r>
+          <w:r>
+            <w:t>.</w:t>
+          </w:r>
+          <w:r>
+            <w:t>6</w:t>
+          </w:r>
+          <w:r>
+            <w:t xml:space="preserve"> </w:t>
+          </w:r>
+          <w:r>
+            <w:t xml:space="preserve">lo – fi </w:t>
+          </w:r>
+          <w:proofErr w:type="spellStart"/>
+          <w:r>
+            <w:t>entregar</w:t>
+          </w:r>
+          <w:proofErr w:type="spellEnd"/>
+          <w:r>
+            <w:t xml:space="preserve"> </w:t>
+          </w:r>
+          <w:proofErr w:type="spellStart"/>
+          <w:r>
+            <w:t>actividades</w:t>
+          </w:r>
+          <w:proofErr w:type="spellEnd"/>
+          <w:r>
+            <w:t xml:space="preserve"> </w:t>
+          </w:r>
+          <w:r>
+            <w:t xml:space="preserve"> </w:t>
+          </w:r>
+          <w:hyperlink w:anchor="_Toc62801090">
+            <w:r>
+              <w:rPr>
+                <w:rStyle w:val="Enlacedelndice"/>
+                <w:webHidden/>
+              </w:rPr>
+              <w:tab/>
+            </w:r>
+          </w:hyperlink>
+          <w:r>
+            <w:t>16</w:t>
+          </w:r>
+        </w:p>
+        <w:p>
+          <w:pPr>
+            <w:pStyle w:val="TDC2"/>
+            <w:tabs>
+              <w:tab w:val="right" w:leader="dot" w:pos="9009"/>
+            </w:tabs>
+            <w:jc w:val="both"/>
+          </w:pPr>
+          <w:r>
+            <w:t>11</w:t>
+          </w:r>
+          <w:r>
+            <w:t>.</w:t>
+          </w:r>
+          <w:r>
+            <w:t>7</w:t>
+          </w:r>
+          <w:r>
+            <w:t xml:space="preserve"> </w:t>
+          </w:r>
+          <w:r>
+            <w:t xml:space="preserve">lo – fi </w:t>
+          </w:r>
+          <w:proofErr w:type="spellStart"/>
+          <w:r>
+            <w:t>entrega</w:t>
+          </w:r>
+          <w:proofErr w:type="spellEnd"/>
+          <w:r>
+            <w:t xml:space="preserve"> de </w:t>
+          </w:r>
+          <w:proofErr w:type="spellStart"/>
+          <w:r>
+            <w:t>notas</w:t>
+          </w:r>
+          <w:proofErr w:type="spellEnd"/>
+          <w:r>
+            <w:t xml:space="preserve">  </w:t>
+          </w:r>
+          <w:r>
+            <w:t xml:space="preserve"> </w:t>
+          </w:r>
+          <w:hyperlink w:anchor="_Toc62801090">
+            <w:r>
+              <w:rPr>
+                <w:rStyle w:val="Enlacedelndice"/>
+                <w:webHidden/>
+              </w:rPr>
+              <w:tab/>
+            </w:r>
+          </w:hyperlink>
+          <w:r>
+            <w:t>16</w:t>
+          </w:r>
+        </w:p>
+        <w:p>
+          <w:pPr>
+            <w:pStyle w:val="TDC2"/>
+            <w:tabs>
+              <w:tab w:val="right" w:leader="dot" w:pos="9009"/>
+            </w:tabs>
+            <w:jc w:val="both"/>
+          </w:pPr>
+          <w:r>
+            <w:t>11</w:t>
+          </w:r>
+          <w:r>
+            <w:t>.</w:t>
+          </w:r>
+          <w:r>
+            <w:t>8</w:t>
+          </w:r>
+          <w:r>
+            <w:t xml:space="preserve"> lo – fi  </w:t>
+          </w:r>
+          <w:proofErr w:type="spellStart"/>
+          <w:r>
+            <w:t>edicion</w:t>
+          </w:r>
+          <w:proofErr w:type="spellEnd"/>
+          <w:r>
+            <w:t xml:space="preserve"> de </w:t>
+          </w:r>
+          <w:proofErr w:type="spellStart"/>
+          <w:r>
+            <w:t>usuarios</w:t>
+          </w:r>
+          <w:proofErr w:type="spellEnd"/>
+          <w:r>
+            <w:t xml:space="preserve"> </w:t>
+          </w:r>
+          <w:r>
+            <w:t xml:space="preserve"> </w:t>
+          </w:r>
+          <w:hyperlink w:anchor="_Toc62801090">
+            <w:r>
+              <w:rPr>
+                <w:rStyle w:val="Enlacedelndice"/>
+                <w:webHidden/>
+              </w:rPr>
+              <w:tab/>
+            </w:r>
+          </w:hyperlink>
+          <w:r>
+            <w:t>16</w:t>
           </w:r>
         </w:p>
         <w:p>
@@ -1695,70 +2003,6 @@
               <w:szCs w:val="22"/>
             </w:rPr>
           </w:pPr>
-          <w:r>
-            <w:rPr>
-              <w:b/>
-              <w:bCs/>
-              <w:sz w:val="22"/>
-              <w:szCs w:val="22"/>
-              <w:lang w:val="es-CO"/>
-            </w:rPr>
-            <w:t>11.</w:t>
-          </w:r>
-          <w:r>
-            <w:rPr>
-              <w:b/>
-              <w:bCs/>
-              <w:sz w:val="22"/>
-              <w:szCs w:val="22"/>
-              <w:lang w:val="es-CO"/>
-            </w:rPr>
-            <w:t xml:space="preserve"> </w:t>
-          </w:r>
-          <w:proofErr w:type="spellStart"/>
-          <w:r>
-            <w:rPr>
-              <w:b/>
-              <w:bCs/>
-              <w:sz w:val="22"/>
-              <w:szCs w:val="22"/>
-              <w:lang w:val="es-CO"/>
-            </w:rPr>
-            <w:t>wiframes</w:t>
-          </w:r>
-          <w:proofErr w:type="spellEnd"/>
-          <w:r>
-            <w:rPr>
-              <w:b/>
-              <w:bCs/>
-              <w:sz w:val="22"/>
-              <w:szCs w:val="22"/>
-              <w:lang w:val="es-CO"/>
-            </w:rPr>
-            <w:t xml:space="preserve"> </w:t>
-          </w:r>
-          <w:proofErr w:type="spellStart"/>
-          <w:r>
-            <w:rPr>
-              <w:b/>
-              <w:bCs/>
-              <w:sz w:val="22"/>
-              <w:szCs w:val="22"/>
-              <w:lang w:val="es-CO"/>
-            </w:rPr>
-            <w:t>low</w:t>
-          </w:r>
-          <w:proofErr w:type="spellEnd"/>
-          <w:r>
-            <w:rPr>
-              <w:b/>
-              <w:bCs/>
-              <w:sz w:val="22"/>
-              <w:szCs w:val="22"/>
-              <w:lang w:val="es-CO"/>
-            </w:rPr>
-            <w:t>-fi</w:t>
-          </w:r>
         </w:p>
       </w:sdtContent>
     </w:sdt>
@@ -1777,259 +2021,6 @@
     <w:p>
       <w:pPr>
         <w:pStyle w:val="TDC1"/>
-        <w:tabs>
-          <w:tab w:val="right" w:leader="dot" w:pos="9009"/>
-        </w:tabs>
-        <w:jc w:val="both"/>
-        <w:rPr>
-          <w:lang w:val="es-CO"/>
-        </w:rPr>
-      </w:pPr>
-    </w:p>
-    <w:p>
-      <w:pPr>
-        <w:tabs>
-          <w:tab w:val="right" w:leader="dot" w:pos="9009"/>
-        </w:tabs>
-        <w:jc w:val="both"/>
-        <w:rPr>
-          <w:lang w:val="es-CO"/>
-        </w:rPr>
-      </w:pPr>
-    </w:p>
-    <w:p>
-      <w:pPr>
-        <w:tabs>
-          <w:tab w:val="right" w:leader="dot" w:pos="9009"/>
-        </w:tabs>
-        <w:jc w:val="both"/>
-        <w:rPr>
-          <w:lang w:val="es-CO"/>
-        </w:rPr>
-      </w:pPr>
-    </w:p>
-    <w:p>
-      <w:pPr>
-        <w:tabs>
-          <w:tab w:val="right" w:leader="dot" w:pos="9009"/>
-        </w:tabs>
-        <w:jc w:val="both"/>
-        <w:rPr>
-          <w:lang w:val="es-CO"/>
-        </w:rPr>
-      </w:pPr>
-    </w:p>
-    <w:p>
-      <w:pPr>
-        <w:tabs>
-          <w:tab w:val="right" w:leader="dot" w:pos="9009"/>
-        </w:tabs>
-        <w:jc w:val="both"/>
-        <w:rPr>
-          <w:lang w:val="es-CO"/>
-        </w:rPr>
-      </w:pPr>
-    </w:p>
-    <w:p>
-      <w:pPr>
-        <w:tabs>
-          <w:tab w:val="right" w:leader="dot" w:pos="9009"/>
-        </w:tabs>
-        <w:jc w:val="both"/>
-        <w:rPr>
-          <w:lang w:val="es-CO"/>
-        </w:rPr>
-      </w:pPr>
-    </w:p>
-    <w:p>
-      <w:pPr>
-        <w:tabs>
-          <w:tab w:val="right" w:leader="dot" w:pos="9009"/>
-        </w:tabs>
-        <w:jc w:val="both"/>
-        <w:rPr>
-          <w:lang w:val="es-CO"/>
-        </w:rPr>
-      </w:pPr>
-    </w:p>
-    <w:p>
-      <w:pPr>
-        <w:tabs>
-          <w:tab w:val="right" w:leader="dot" w:pos="9009"/>
-        </w:tabs>
-        <w:jc w:val="both"/>
-        <w:rPr>
-          <w:lang w:val="es-CO"/>
-        </w:rPr>
-      </w:pPr>
-    </w:p>
-    <w:p>
-      <w:pPr>
-        <w:tabs>
-          <w:tab w:val="right" w:leader="dot" w:pos="9009"/>
-        </w:tabs>
-        <w:jc w:val="both"/>
-        <w:rPr>
-          <w:lang w:val="es-CO"/>
-        </w:rPr>
-      </w:pPr>
-    </w:p>
-    <w:p>
-      <w:pPr>
-        <w:tabs>
-          <w:tab w:val="right" w:leader="dot" w:pos="9009"/>
-        </w:tabs>
-        <w:jc w:val="both"/>
-        <w:rPr>
-          <w:lang w:val="es-CO"/>
-        </w:rPr>
-      </w:pPr>
-    </w:p>
-    <w:p>
-      <w:pPr>
-        <w:tabs>
-          <w:tab w:val="right" w:leader="dot" w:pos="9009"/>
-        </w:tabs>
-        <w:jc w:val="both"/>
-        <w:rPr>
-          <w:lang w:val="es-CO"/>
-        </w:rPr>
-      </w:pPr>
-    </w:p>
-    <w:p>
-      <w:pPr>
-        <w:tabs>
-          <w:tab w:val="right" w:leader="dot" w:pos="9009"/>
-        </w:tabs>
-        <w:jc w:val="both"/>
-        <w:rPr>
-          <w:lang w:val="es-CO"/>
-        </w:rPr>
-      </w:pPr>
-    </w:p>
-    <w:p>
-      <w:pPr>
-        <w:tabs>
-          <w:tab w:val="right" w:leader="dot" w:pos="9009"/>
-        </w:tabs>
-        <w:jc w:val="both"/>
-        <w:rPr>
-          <w:lang w:val="es-CO"/>
-        </w:rPr>
-      </w:pPr>
-    </w:p>
-    <w:p>
-      <w:pPr>
-        <w:tabs>
-          <w:tab w:val="right" w:leader="dot" w:pos="9009"/>
-        </w:tabs>
-        <w:jc w:val="both"/>
-        <w:rPr>
-          <w:lang w:val="es-CO"/>
-        </w:rPr>
-      </w:pPr>
-    </w:p>
-    <w:p>
-      <w:pPr>
-        <w:tabs>
-          <w:tab w:val="right" w:leader="dot" w:pos="9009"/>
-        </w:tabs>
-        <w:jc w:val="both"/>
-        <w:rPr>
-          <w:lang w:val="es-CO"/>
-        </w:rPr>
-      </w:pPr>
-    </w:p>
-    <w:p>
-      <w:pPr>
-        <w:tabs>
-          <w:tab w:val="right" w:leader="dot" w:pos="9009"/>
-        </w:tabs>
-        <w:jc w:val="both"/>
-        <w:rPr>
-          <w:lang w:val="es-CO"/>
-        </w:rPr>
-      </w:pPr>
-    </w:p>
-    <w:p>
-      <w:pPr>
-        <w:tabs>
-          <w:tab w:val="right" w:leader="dot" w:pos="9009"/>
-        </w:tabs>
-        <w:jc w:val="both"/>
-        <w:rPr>
-          <w:lang w:val="es-CO"/>
-        </w:rPr>
-      </w:pPr>
-    </w:p>
-    <w:p>
-      <w:pPr>
-        <w:tabs>
-          <w:tab w:val="right" w:leader="dot" w:pos="9009"/>
-        </w:tabs>
-        <w:jc w:val="both"/>
-        <w:rPr>
-          <w:lang w:val="es-CO"/>
-        </w:rPr>
-      </w:pPr>
-    </w:p>
-    <w:p>
-      <w:pPr>
-        <w:tabs>
-          <w:tab w:val="right" w:leader="dot" w:pos="9009"/>
-        </w:tabs>
-        <w:jc w:val="both"/>
-        <w:rPr>
-          <w:lang w:val="es-CO"/>
-        </w:rPr>
-      </w:pPr>
-    </w:p>
-    <w:p>
-      <w:pPr>
-        <w:tabs>
-          <w:tab w:val="right" w:leader="dot" w:pos="9009"/>
-        </w:tabs>
-        <w:jc w:val="both"/>
-        <w:rPr>
-          <w:lang w:val="es-CO"/>
-        </w:rPr>
-      </w:pPr>
-    </w:p>
-    <w:p>
-      <w:pPr>
-        <w:tabs>
-          <w:tab w:val="right" w:leader="dot" w:pos="9009"/>
-        </w:tabs>
-        <w:jc w:val="both"/>
-        <w:rPr>
-          <w:lang w:val="es-CO"/>
-        </w:rPr>
-      </w:pPr>
-    </w:p>
-    <w:p>
-      <w:pPr>
-        <w:tabs>
-          <w:tab w:val="right" w:leader="dot" w:pos="9009"/>
-        </w:tabs>
-        <w:jc w:val="both"/>
-        <w:rPr>
-          <w:lang w:val="es-CO"/>
-        </w:rPr>
-      </w:pPr>
-    </w:p>
-    <w:p>
-      <w:pPr>
-        <w:tabs>
-          <w:tab w:val="right" w:leader="dot" w:pos="9009"/>
-        </w:tabs>
-        <w:jc w:val="both"/>
-        <w:rPr>
-          <w:lang w:val="es-CO"/>
-        </w:rPr>
-      </w:pPr>
-    </w:p>
-    <w:p>
-      <w:pPr>
         <w:tabs>
           <w:tab w:val="right" w:leader="dot" w:pos="9009"/>
         </w:tabs>
@@ -2237,13 +2228,8 @@
       <w:bookmarkStart w:id="52" w:name="_Toc26079248"/>
       <w:bookmarkStart w:id="53" w:name="_Toc26076889"/>
       <w:bookmarkStart w:id="54" w:name="_Toc316718173"/>
-      <w:proofErr w:type="gramStart"/>
-      <w:r>
-        <w:t>Introducción</w:t>
-      </w:r>
-      <w:proofErr w:type="gramEnd"/>
-      <w:r>
-        <w:t xml:space="preserve"> </w:t>
+      <w:r>
+        <w:t xml:space="preserve">Introducción </w:t>
       </w:r>
       <w:bookmarkEnd w:id="47"/>
       <w:bookmarkEnd w:id="48"/>
@@ -2270,6 +2256,7 @@
           <w:shd w:val="clear" w:color="auto" w:fill="FFFFFF"/>
           <w:lang w:val="es-CO"/>
         </w:rPr>
+        <w:lastRenderedPageBreak/>
         <w:t xml:space="preserve">Se realiza un análisis para el desarrollo del presente proyecto el cual </w:t>
       </w:r>
       <w:proofErr w:type="spellStart"/>
@@ -2458,15 +2445,7 @@
         <w:pStyle w:val="APALevel2"/>
       </w:pPr>
       <w:r>
-        <w:t xml:space="preserve">En </w:t>
-      </w:r>
-      <w:proofErr w:type="gramStart"/>
-      <w:r>
-        <w:t>conclusión</w:t>
-      </w:r>
-      <w:proofErr w:type="gramEnd"/>
-      <w:r>
-        <w:t xml:space="preserve"> </w:t>
+        <w:t xml:space="preserve">En conclusión </w:t>
       </w:r>
       <w:proofErr w:type="spellStart"/>
       <w:r>
@@ -2474,15 +2453,7 @@
       </w:r>
       <w:proofErr w:type="spellEnd"/>
       <w:r>
-        <w:t xml:space="preserve"> proporciona un entorno digital estructurado que mejora la comunicación, promueve organización académica y apoya el crecimiento digital en </w:t>
-      </w:r>
-      <w:proofErr w:type="gramStart"/>
-      <w:r>
-        <w:t>las  instituciones</w:t>
-      </w:r>
-      <w:proofErr w:type="gramEnd"/>
-      <w:r>
-        <w:t xml:space="preserve"> educativas.</w:t>
+        <w:t xml:space="preserve"> proporciona un entorno digital estructurado que mejora la comunicación, promueve organización académica y apoya el crecimiento digital en las  instituciones educativas.</w:t>
       </w:r>
     </w:p>
     <w:p>
@@ -2676,6 +2647,7 @@
           <w:color w:val="000000"/>
           <w:lang w:val="es-CO"/>
         </w:rPr>
+        <w:lastRenderedPageBreak/>
         <w:t>Lider</w:t>
       </w:r>
       <w:proofErr w:type="spellEnd"/>
@@ -2872,15 +2844,7 @@
         </w:numPr>
       </w:pPr>
       <w:r>
-        <w:t xml:space="preserve">Análisis y requisitos: El equipo realiza una reunión con docentes y encuestas a estudiantes para reconocer las principales dificultades en la gestión de actividades y aprendizaje académico se detecta que hace falta una herramienta centralizada para la asignación de tareas y la entrega de </w:t>
-      </w:r>
-      <w:proofErr w:type="gramStart"/>
-      <w:r>
-        <w:t>las mismas</w:t>
-      </w:r>
-      <w:proofErr w:type="gramEnd"/>
-      <w:r>
-        <w:t xml:space="preserve"> se definen los requisitos </w:t>
+        <w:t xml:space="preserve">Análisis y requisitos: El equipo realiza una reunión con docentes y encuestas a estudiantes para reconocer las principales dificultades en la gestión de actividades y aprendizaje académico se detecta que hace falta una herramienta centralizada para la asignación de tareas y la entrega de las mismas se definen los requisitos </w:t>
       </w:r>
       <w:proofErr w:type="spellStart"/>
       <w:r>
@@ -2908,15 +2872,7 @@
       </w:r>
       <w:proofErr w:type="spellEnd"/>
       <w:r>
-        <w:t xml:space="preserve"> software, se construye el modelo de bases de datos con las diferentes entidades también se establecen los roles del sistema como </w:t>
-      </w:r>
-      <w:proofErr w:type="gramStart"/>
-      <w:r>
-        <w:t>docente estudiantes</w:t>
-      </w:r>
-      <w:proofErr w:type="gramEnd"/>
-      <w:r>
-        <w:t xml:space="preserve">. </w:t>
+        <w:t xml:space="preserve"> software, se construye el modelo de bases de datos con las diferentes entidades también se establecen los roles del sistema como docente estudiantes. </w:t>
       </w:r>
     </w:p>
     <w:p>
@@ -3181,25 +3137,7 @@
           <w:sz w:val="24"/>
           <w:szCs w:val="24"/>
         </w:rPr>
-        <w:t xml:space="preserve">Se </w:t>
-      </w:r>
-      <w:proofErr w:type="gramStart"/>
-      <w:r>
-        <w:rPr>
-          <w:rFonts w:ascii="Times New Roman" w:hAnsi="Times New Roman"/>
-          <w:sz w:val="24"/>
-          <w:szCs w:val="24"/>
-        </w:rPr>
-        <w:t>utilizara</w:t>
-      </w:r>
-      <w:proofErr w:type="gramEnd"/>
-      <w:r>
-        <w:rPr>
-          <w:rFonts w:ascii="Times New Roman" w:hAnsi="Times New Roman"/>
-          <w:sz w:val="24"/>
-          <w:szCs w:val="24"/>
-        </w:rPr>
-        <w:t xml:space="preserve"> la metodología ágil de scrum que permite dividir el proyecto en iteraciones cortas llamadas </w:t>
+        <w:t xml:space="preserve">Se utilizara la metodología ágil de scrum que permite dividir el proyecto en iteraciones cortas llamadas </w:t>
       </w:r>
       <w:proofErr w:type="spellStart"/>
       <w:r>
@@ -3387,7 +3325,7 @@
         </w:rPr>
         <w:lastRenderedPageBreak/>
         <w:drawing>
-          <wp:anchor distT="0" distB="0" distL="114300" distR="114300" simplePos="0" relativeHeight="251492864" behindDoc="0" locked="0" layoutInCell="0" allowOverlap="1" wp14:anchorId="0123C0DF" wp14:editId="1DF3DD6D">
+          <wp:anchor distT="0" distB="0" distL="114300" distR="114300" simplePos="0" relativeHeight="251644416" behindDoc="0" locked="0" layoutInCell="0" allowOverlap="1" wp14:anchorId="0123C0DF" wp14:editId="1DF3DD6D">
             <wp:simplePos x="0" y="0"/>
             <wp:positionH relativeFrom="column">
               <wp:posOffset>60325</wp:posOffset>
@@ -3595,25 +3533,25 @@
           <w:shd w:val="clear" w:color="auto" w:fill="FFFFFF"/>
           <w:lang w:val="es-CO"/>
         </w:rPr>
-        <w:t xml:space="preserve"> nos permite organizar las tareas </w:t>
-      </w:r>
-      <w:proofErr w:type="gramStart"/>
+        <w:t xml:space="preserve"> nos permite organizar las tareas de acuerdo a las entregas en el primer </w:t>
+      </w:r>
+      <w:proofErr w:type="spellStart"/>
       <w:r>
         <w:rPr>
           <w:color w:val="000000"/>
           <w:shd w:val="clear" w:color="auto" w:fill="FFFFFF"/>
           <w:lang w:val="es-CO"/>
         </w:rPr>
-        <w:t>de acuerdo a</w:t>
-      </w:r>
-      <w:proofErr w:type="gramEnd"/>
+        <w:t>sprints</w:t>
+      </w:r>
+      <w:proofErr w:type="spellEnd"/>
       <w:r>
         <w:rPr>
           <w:color w:val="000000"/>
           <w:shd w:val="clear" w:color="auto" w:fill="FFFFFF"/>
           <w:lang w:val="es-CO"/>
         </w:rPr>
-        <w:t xml:space="preserve"> las entregas en el primer </w:t>
+        <w:t xml:space="preserve"> las tareas están enfocadas a los usuarios como </w:t>
       </w:r>
       <w:proofErr w:type="spellStart"/>
       <w:r>
@@ -3622,7 +3560,7 @@
           <w:shd w:val="clear" w:color="auto" w:fill="FFFFFF"/>
           <w:lang w:val="es-CO"/>
         </w:rPr>
-        <w:t>sprints</w:t>
+        <w:t>login</w:t>
       </w:r>
       <w:proofErr w:type="spellEnd"/>
       <w:r>
@@ -3631,43 +3569,7 @@
           <w:shd w:val="clear" w:color="auto" w:fill="FFFFFF"/>
           <w:lang w:val="es-CO"/>
         </w:rPr>
-        <w:t xml:space="preserve"> las tareas están enfocadas a los usuarios como </w:t>
-      </w:r>
-      <w:proofErr w:type="spellStart"/>
-      <w:r>
-        <w:rPr>
-          <w:color w:val="000000"/>
-          <w:shd w:val="clear" w:color="auto" w:fill="FFFFFF"/>
-          <w:lang w:val="es-CO"/>
-        </w:rPr>
-        <w:t>login</w:t>
-      </w:r>
-      <w:proofErr w:type="spellEnd"/>
-      <w:r>
-        <w:rPr>
-          <w:color w:val="000000"/>
-          <w:shd w:val="clear" w:color="auto" w:fill="FFFFFF"/>
-          <w:lang w:val="es-CO"/>
-        </w:rPr>
-        <w:t xml:space="preserve"> y registro el segundo a las funcionalidades del sistema y el tercero a la mejora de la calidad comparto el </w:t>
-      </w:r>
-      <w:proofErr w:type="gramStart"/>
-      <w:r>
-        <w:rPr>
-          <w:color w:val="000000"/>
-          <w:shd w:val="clear" w:color="auto" w:fill="FFFFFF"/>
-          <w:lang w:val="es-CO"/>
-        </w:rPr>
-        <w:t>link</w:t>
-      </w:r>
-      <w:proofErr w:type="gramEnd"/>
-      <w:r>
-        <w:rPr>
-          <w:color w:val="000000"/>
-          <w:shd w:val="clear" w:color="auto" w:fill="FFFFFF"/>
-          <w:lang w:val="es-CO"/>
-        </w:rPr>
-        <w:t xml:space="preserve"> del tablero en jira</w:t>
+        <w:t xml:space="preserve"> y registro el segundo a las funcionalidades del sistema y el tercero a la mejora de la calidad comparto el link del tablero en jira</w:t>
       </w:r>
     </w:p>
     <w:p>
@@ -4716,7 +4618,7 @@
           <w:szCs w:val="24"/>
         </w:rPr>
         <w:drawing>
-          <wp:anchor distT="0" distB="0" distL="114300" distR="114300" simplePos="0" relativeHeight="251812352" behindDoc="0" locked="0" layoutInCell="0" allowOverlap="1" wp14:anchorId="4ABE9132" wp14:editId="4EC370E3">
+          <wp:anchor distT="0" distB="0" distL="114300" distR="114300" simplePos="0" relativeHeight="251666944" behindDoc="0" locked="0" layoutInCell="0" allowOverlap="1" wp14:anchorId="4ABE9132" wp14:editId="4EC370E3">
             <wp:simplePos x="0" y="0"/>
             <wp:positionH relativeFrom="column">
               <wp:posOffset>450215</wp:posOffset>
@@ -4914,25 +4816,7 @@
           <w:sz w:val="24"/>
           <w:szCs w:val="24"/>
         </w:rPr>
-        <w:t xml:space="preserve">Joaquin es un estudiante de 15 que realiza también múltiples actividades en su día a día necesita </w:t>
-      </w:r>
-      <w:proofErr w:type="gramStart"/>
-      <w:r>
-        <w:rPr>
-          <w:rFonts w:ascii="Times New Roman" w:hAnsi="Times New Roman"/>
-          <w:sz w:val="24"/>
-          <w:szCs w:val="24"/>
-        </w:rPr>
-        <w:t>un plataforma accesible</w:t>
-      </w:r>
-      <w:proofErr w:type="gramEnd"/>
-      <w:r>
-        <w:rPr>
-          <w:rFonts w:ascii="Times New Roman" w:hAnsi="Times New Roman"/>
-          <w:sz w:val="24"/>
-          <w:szCs w:val="24"/>
-        </w:rPr>
-        <w:t xml:space="preserve"> que le permita entregar sus trabajos de forma rápida y que sirva también para tener la información de sus materias de una forma </w:t>
+        <w:t xml:space="preserve">Joaquin es un estudiante de 15 que realiza también múltiples actividades en su día a día necesita un plataforma accesible que le permita entregar sus trabajos de forma rápida y que sirva también para tener la información de sus materias de una forma </w:t>
       </w:r>
       <w:proofErr w:type="spellStart"/>
       <w:r>
@@ -5050,25 +4934,7 @@
           <w:sz w:val="24"/>
           <w:szCs w:val="24"/>
         </w:rPr>
-        <w:t xml:space="preserve"> que los estudiantes están teniendo problemas para organizar entregas de manera </w:t>
-      </w:r>
-      <w:proofErr w:type="gramStart"/>
-      <w:r>
-        <w:rPr>
-          <w:rFonts w:ascii="Times New Roman" w:hAnsi="Times New Roman"/>
-          <w:sz w:val="24"/>
-          <w:szCs w:val="24"/>
-        </w:rPr>
-        <w:t>eficiente</w:t>
-      </w:r>
-      <w:proofErr w:type="gramEnd"/>
-      <w:r>
-        <w:rPr>
-          <w:rFonts w:ascii="Times New Roman" w:hAnsi="Times New Roman"/>
-          <w:sz w:val="24"/>
-          <w:szCs w:val="24"/>
-        </w:rPr>
-        <w:t xml:space="preserve"> así como foros de información en los que los docentes puedan tener una herramienta que centralice la gestión académica </w:t>
+        <w:t xml:space="preserve"> que los estudiantes están teniendo problemas para organizar entregas de manera eficiente así como foros de información en los que los docentes puedan tener una herramienta que centralice la gestión académica </w:t>
       </w:r>
     </w:p>
     <w:p>
@@ -5189,18 +5055,8 @@
           <w:sz w:val="24"/>
           <w:szCs w:val="24"/>
         </w:rPr>
-        <w:t xml:space="preserve"> se plantearon ideas </w:t>
-      </w:r>
-      <w:proofErr w:type="gramStart"/>
-      <w:r>
-        <w:rPr>
-          <w:rFonts w:ascii="Times New Roman" w:hAnsi="Times New Roman"/>
-          <w:sz w:val="24"/>
-          <w:szCs w:val="24"/>
-        </w:rPr>
-        <w:t>como :</w:t>
-      </w:r>
-      <w:proofErr w:type="gramEnd"/>
+        <w:t xml:space="preserve"> se plantearon ideas como :</w:t>
+      </w:r>
     </w:p>
     <w:p>
       <w:pPr>
@@ -5586,7 +5442,7 @@
             <w:noProof/>
           </w:rPr>
           <w:drawing>
-            <wp:anchor distT="0" distB="0" distL="0" distR="0" simplePos="0" relativeHeight="251679232" behindDoc="0" locked="0" layoutInCell="0" allowOverlap="1" wp14:anchorId="05A3CF3F" wp14:editId="7CADE818">
+            <wp:anchor distT="0" distB="0" distL="0" distR="0" simplePos="0" relativeHeight="251661824" behindDoc="0" locked="0" layoutInCell="0" allowOverlap="1" wp14:anchorId="05A3CF3F" wp14:editId="7CADE818">
               <wp:simplePos x="0" y="0"/>
               <wp:positionH relativeFrom="column">
                 <wp:posOffset>0</wp:posOffset>
@@ -5705,7 +5561,7 @@
         </w:rPr>
         <w:lastRenderedPageBreak/>
         <w:drawing>
-          <wp:anchor distT="0" distB="0" distL="0" distR="0" simplePos="0" relativeHeight="251705856" behindDoc="0" locked="0" layoutInCell="0" allowOverlap="1" wp14:anchorId="0AC312E4" wp14:editId="4832E88D">
+          <wp:anchor distT="0" distB="0" distL="0" distR="0" simplePos="0" relativeHeight="251662848" behindDoc="0" locked="0" layoutInCell="0" allowOverlap="1" wp14:anchorId="0AC312E4" wp14:editId="4832E88D">
             <wp:simplePos x="0" y="0"/>
             <wp:positionH relativeFrom="column">
               <wp:posOffset>0</wp:posOffset>
@@ -5850,7 +5706,7 @@
             <w:noProof/>
           </w:rPr>
           <w:drawing>
-            <wp:anchor distT="0" distB="0" distL="0" distR="0" simplePos="0" relativeHeight="251732480" behindDoc="0" locked="0" layoutInCell="0" allowOverlap="1" wp14:anchorId="55BFC76C" wp14:editId="609B9AF4">
+            <wp:anchor distT="0" distB="0" distL="0" distR="0" simplePos="0" relativeHeight="251663872" behindDoc="0" locked="0" layoutInCell="0" allowOverlap="1" wp14:anchorId="55BFC76C" wp14:editId="609B9AF4">
               <wp:simplePos x="0" y="0"/>
               <wp:positionH relativeFrom="column">
                 <wp:posOffset>32385</wp:posOffset>
@@ -5972,7 +5828,7 @@
         </w:rPr>
         <w:lastRenderedPageBreak/>
         <w:drawing>
-          <wp:anchor distT="0" distB="0" distL="0" distR="0" simplePos="0" relativeHeight="251759104" behindDoc="0" locked="0" layoutInCell="0" allowOverlap="1" wp14:anchorId="258A38EC" wp14:editId="77165987">
+          <wp:anchor distT="0" distB="0" distL="0" distR="0" simplePos="0" relativeHeight="251664896" behindDoc="0" locked="0" layoutInCell="0" allowOverlap="1" wp14:anchorId="258A38EC" wp14:editId="77165987">
             <wp:simplePos x="0" y="0"/>
             <wp:positionH relativeFrom="column">
               <wp:posOffset>27305</wp:posOffset>
@@ -6089,7 +5945,7 @@
           <w:noProof/>
         </w:rPr>
         <w:drawing>
-          <wp:anchor distT="0" distB="0" distL="0" distR="0" simplePos="0" relativeHeight="251785728" behindDoc="0" locked="0" layoutInCell="0" allowOverlap="1" wp14:anchorId="6E47A7BF" wp14:editId="4ADB41D7">
+          <wp:anchor distT="0" distB="0" distL="0" distR="0" simplePos="0" relativeHeight="251665920" behindDoc="0" locked="0" layoutInCell="0" allowOverlap="1" wp14:anchorId="6E47A7BF" wp14:editId="4ADB41D7">
             <wp:simplePos x="0" y="0"/>
             <wp:positionH relativeFrom="column">
               <wp:posOffset>3810</wp:posOffset>
@@ -6278,7 +6134,7 @@
         </w:rPr>
         <w:lastRenderedPageBreak/>
         <w:drawing>
-          <wp:anchor distT="0" distB="0" distL="114300" distR="114300" simplePos="0" relativeHeight="251519488" behindDoc="0" locked="0" layoutInCell="0" allowOverlap="1" wp14:anchorId="3C46D628" wp14:editId="2F825226">
+          <wp:anchor distT="0" distB="0" distL="114300" distR="114300" simplePos="0" relativeHeight="251645440" behindDoc="0" locked="0" layoutInCell="0" allowOverlap="1" wp14:anchorId="3C46D628" wp14:editId="2F825226">
             <wp:simplePos x="0" y="0"/>
             <wp:positionH relativeFrom="column">
               <wp:posOffset>-23495</wp:posOffset>
@@ -7058,7 +6914,7 @@
         </w:rPr>
         <w:lastRenderedPageBreak/>
         <w:drawing>
-          <wp:anchor distT="0" distB="0" distL="0" distR="0" simplePos="0" relativeHeight="251546112" behindDoc="0" locked="0" layoutInCell="0" allowOverlap="1" wp14:anchorId="03835003" wp14:editId="35965472">
+          <wp:anchor distT="0" distB="0" distL="0" distR="0" simplePos="0" relativeHeight="251646464" behindDoc="0" locked="0" layoutInCell="0" allowOverlap="1" wp14:anchorId="03835003" wp14:editId="35965472">
             <wp:simplePos x="0" y="0"/>
             <wp:positionH relativeFrom="column">
               <wp:posOffset>-15240</wp:posOffset>
@@ -7152,7 +7008,7 @@
           <w:noProof/>
         </w:rPr>
         <w:drawing>
-          <wp:anchor distT="0" distB="0" distL="0" distR="0" simplePos="0" relativeHeight="251572736" behindDoc="0" locked="0" layoutInCell="0" allowOverlap="1" wp14:anchorId="453E9B4A" wp14:editId="63326EAE">
+          <wp:anchor distT="0" distB="0" distL="0" distR="0" simplePos="0" relativeHeight="251647488" behindDoc="0" locked="0" layoutInCell="0" allowOverlap="1" wp14:anchorId="453E9B4A" wp14:editId="63326EAE">
             <wp:simplePos x="0" y="0"/>
             <wp:positionH relativeFrom="column">
               <wp:posOffset>-5715</wp:posOffset>
@@ -7248,7 +7104,7 @@
         </w:rPr>
         <w:lastRenderedPageBreak/>
         <w:drawing>
-          <wp:anchor distT="0" distB="0" distL="0" distR="0" simplePos="0" relativeHeight="251599360" behindDoc="0" locked="0" layoutInCell="0" allowOverlap="1" wp14:anchorId="3C6A89DF" wp14:editId="20CCFE2D">
+          <wp:anchor distT="0" distB="0" distL="0" distR="0" simplePos="0" relativeHeight="251648512" behindDoc="0" locked="0" layoutInCell="0" allowOverlap="1" wp14:anchorId="3C6A89DF" wp14:editId="20CCFE2D">
             <wp:simplePos x="0" y="0"/>
             <wp:positionH relativeFrom="column">
               <wp:posOffset>0</wp:posOffset>
@@ -7346,7 +7202,7 @@
           <w:noProof/>
         </w:rPr>
         <w:drawing>
-          <wp:anchor distT="0" distB="0" distL="0" distR="0" simplePos="0" relativeHeight="251625984" behindDoc="0" locked="0" layoutInCell="0" allowOverlap="1" wp14:anchorId="24E7B880" wp14:editId="75303C54">
+          <wp:anchor distT="0" distB="0" distL="0" distR="0" simplePos="0" relativeHeight="251649536" behindDoc="0" locked="0" layoutInCell="0" allowOverlap="1" wp14:anchorId="24E7B880" wp14:editId="75303C54">
             <wp:simplePos x="0" y="0"/>
             <wp:positionH relativeFrom="column">
               <wp:posOffset>12065</wp:posOffset>
@@ -7603,23 +7459,7 @@
           <w:color w:val="1F1F1F"/>
           <w:lang w:val="es-CO"/>
         </w:rPr>
-        <w:t xml:space="preserve"> coherente las funcionalidades </w:t>
-      </w:r>
-      <w:proofErr w:type="gramStart"/>
-      <w:r>
-        <w:rPr>
-          <w:color w:val="1F1F1F"/>
-          <w:lang w:val="es-CO"/>
-        </w:rPr>
-        <w:t>requeridas  y</w:t>
-      </w:r>
-      <w:proofErr w:type="gramEnd"/>
-      <w:r>
-        <w:rPr>
-          <w:color w:val="1F1F1F"/>
-          <w:lang w:val="es-CO"/>
-        </w:rPr>
-        <w:t xml:space="preserve"> la planeación por etapas.</w:t>
+        <w:t xml:space="preserve"> coherente las funcionalidades requeridas  y la planeación por etapas.</w:t>
       </w:r>
     </w:p>
     <w:p>
@@ -7922,13 +7762,156 @@
           <w:u w:val="single"/>
         </w:rPr>
       </w:pPr>
+    </w:p>
+    <w:p>
+      <w:pPr>
+        <w:pStyle w:val="Textoindependiente"/>
+        <w:rPr>
+          <w:b/>
+          <w:bCs/>
+          <w:color w:val="2315DA"/>
+          <w:u w:val="single"/>
+        </w:rPr>
+      </w:pPr>
+    </w:p>
+    <w:p>
+      <w:pPr>
+        <w:pStyle w:val="Textoindependiente"/>
+        <w:rPr>
+          <w:b/>
+          <w:bCs/>
+          <w:color w:val="2315DA"/>
+          <w:u w:val="single"/>
+        </w:rPr>
+      </w:pPr>
+    </w:p>
+    <w:p>
+      <w:pPr>
+        <w:pStyle w:val="Textoindependiente"/>
+        <w:rPr>
+          <w:b/>
+          <w:bCs/>
+          <w:color w:val="2315DA"/>
+          <w:u w:val="single"/>
+        </w:rPr>
+      </w:pPr>
+    </w:p>
+    <w:p>
+      <w:pPr>
+        <w:pStyle w:val="Textoindependiente"/>
+        <w:rPr>
+          <w:b/>
+          <w:bCs/>
+          <w:color w:val="2315DA"/>
+          <w:u w:val="single"/>
+        </w:rPr>
+      </w:pPr>
+    </w:p>
+    <w:p>
+      <w:pPr>
+        <w:pStyle w:val="Textoindependiente"/>
+        <w:rPr>
+          <w:b/>
+          <w:bCs/>
+          <w:color w:val="2315DA"/>
+          <w:u w:val="single"/>
+        </w:rPr>
+      </w:pPr>
+    </w:p>
+    <w:p>
+      <w:pPr>
+        <w:pStyle w:val="Textoindependiente"/>
+        <w:rPr>
+          <w:b/>
+          <w:bCs/>
+          <w:color w:val="2315DA"/>
+          <w:u w:val="single"/>
+        </w:rPr>
+      </w:pPr>
+    </w:p>
+    <w:p>
+      <w:pPr>
+        <w:pStyle w:val="Textoindependiente"/>
+        <w:rPr>
+          <w:b/>
+          <w:bCs/>
+          <w:color w:val="2315DA"/>
+          <w:u w:val="single"/>
+        </w:rPr>
+      </w:pPr>
+    </w:p>
+    <w:p>
+      <w:pPr>
+        <w:pStyle w:val="Textoindependiente"/>
+        <w:rPr>
+          <w:b/>
+          <w:bCs/>
+          <w:color w:val="2315DA"/>
+          <w:u w:val="single"/>
+        </w:rPr>
+      </w:pPr>
+    </w:p>
+    <w:p>
+      <w:pPr>
+        <w:pStyle w:val="Textoindependiente"/>
+        <w:rPr>
+          <w:b/>
+          <w:bCs/>
+          <w:color w:val="2315DA"/>
+          <w:u w:val="single"/>
+        </w:rPr>
+      </w:pPr>
+    </w:p>
+    <w:p>
+      <w:pPr>
+        <w:pStyle w:val="Textoindependiente"/>
+        <w:rPr>
+          <w:b/>
+          <w:bCs/>
+          <w:color w:val="2315DA"/>
+          <w:u w:val="single"/>
+        </w:rPr>
+      </w:pPr>
+    </w:p>
+    <w:p>
+      <w:pPr>
+        <w:pStyle w:val="Textoindependiente"/>
+        <w:rPr>
+          <w:b/>
+          <w:bCs/>
+          <w:color w:val="2315DA"/>
+          <w:u w:val="single"/>
+        </w:rPr>
+      </w:pPr>
+    </w:p>
+    <w:p>
+      <w:pPr>
+        <w:pStyle w:val="Textoindependiente"/>
+        <w:rPr>
+          <w:b/>
+          <w:bCs/>
+          <w:color w:val="2315DA"/>
+          <w:u w:val="single"/>
+        </w:rPr>
+      </w:pPr>
+    </w:p>
+    <w:p>
+      <w:pPr>
+        <w:pStyle w:val="Textoindependiente"/>
+        <w:rPr>
+          <w:b/>
+          <w:bCs/>
+          <w:color w:val="2315DA"/>
+          <w:u w:val="single"/>
+        </w:rPr>
+      </w:pPr>
       <w:r>
         <w:rPr>
           <w:noProof/>
           <w:lang w:val="es-CO"/>
         </w:rPr>
         <w:drawing>
-          <wp:anchor distT="0" distB="0" distL="0" distR="0" simplePos="0" relativeHeight="251845120" behindDoc="0" locked="0" layoutInCell="0" allowOverlap="1" wp14:anchorId="14644A3F" wp14:editId="488D0224">
+          <wp:anchor distT="0" distB="0" distL="0" distR="0" simplePos="0" relativeHeight="251668992" behindDoc="0" locked="0" layoutInCell="0" allowOverlap="1" wp14:anchorId="14644A3F" wp14:editId="488D0224">
             <wp:simplePos x="0" y="0"/>
             <wp:positionH relativeFrom="column">
               <wp:posOffset>1454785</wp:posOffset>
@@ -8022,42 +8005,6 @@
     </w:p>
     <w:p>
       <w:pPr>
-        <w:pStyle w:val="cartula1UDLA"/>
-        <w:jc w:val="left"/>
-        <w:rPr>
-          <w:lang w:val="es-CO"/>
-        </w:rPr>
-      </w:pPr>
-    </w:p>
-    <w:p>
-      <w:pPr>
-        <w:pStyle w:val="cartula1UDLA"/>
-        <w:jc w:val="left"/>
-        <w:rPr>
-          <w:lang w:val="es-CO"/>
-        </w:rPr>
-      </w:pPr>
-    </w:p>
-    <w:p>
-      <w:pPr>
-        <w:pStyle w:val="cartula1UDLA"/>
-        <w:jc w:val="left"/>
-        <w:rPr>
-          <w:lang w:val="es-CO"/>
-        </w:rPr>
-      </w:pPr>
-    </w:p>
-    <w:p>
-      <w:pPr>
-        <w:pStyle w:val="cartula1UDLA"/>
-        <w:jc w:val="left"/>
-        <w:rPr>
-          <w:lang w:val="es-CO"/>
-        </w:rPr>
-      </w:pPr>
-    </w:p>
-    <w:p>
-      <w:pPr>
         <w:pStyle w:val="APALevel1"/>
       </w:pPr>
       <w:r>
@@ -8081,6 +8028,21 @@
       <w:r>
         <w:t>Actividad 2</w:t>
       </w:r>
+    </w:p>
+    <w:p>
+      <w:pPr>
+        <w:pStyle w:val="Ttulo1"/>
+      </w:pPr>
+    </w:p>
+    <w:p>
+      <w:pPr>
+        <w:pStyle w:val="Ttulo1"/>
+      </w:pPr>
+    </w:p>
+    <w:p>
+      <w:pPr>
+        <w:pStyle w:val="Ttulo1"/>
+      </w:pPr>
     </w:p>
     <w:p>
       <w:pPr>
@@ -8108,7 +8070,6 @@
           <w:sz w:val="56"/>
           <w:szCs w:val="56"/>
         </w:rPr>
-        <w:lastRenderedPageBreak/>
         <w:t xml:space="preserve">10 </w:t>
       </w:r>
       <w:r>
@@ -8264,6 +8225,7 @@
           <w:sz w:val="48"/>
           <w:szCs w:val="48"/>
         </w:rPr>
+        <w:lastRenderedPageBreak/>
         <w:br/>
       </w:r>
       <w:proofErr w:type="spellStart"/>
@@ -8401,7 +8363,7 @@
         </w:rPr>
         <w:lastRenderedPageBreak/>
         <w:drawing>
-          <wp:anchor distT="0" distB="0" distL="114300" distR="114300" simplePos="0" relativeHeight="251847168" behindDoc="0" locked="0" layoutInCell="1" allowOverlap="1" wp14:anchorId="38DAD0B2" wp14:editId="6497EBE1">
+          <wp:anchor distT="0" distB="0" distL="114300" distR="114300" simplePos="0" relativeHeight="251670016" behindDoc="0" locked="0" layoutInCell="1" allowOverlap="1" wp14:anchorId="38DAD0B2" wp14:editId="6497EBE1">
             <wp:simplePos x="0" y="0"/>
             <wp:positionH relativeFrom="column">
               <wp:posOffset>-228600</wp:posOffset>
@@ -8508,7 +8470,7 @@
         </w:rPr>
         <w:lastRenderedPageBreak/>
         <w:drawing>
-          <wp:anchor distT="0" distB="0" distL="114300" distR="114300" simplePos="0" relativeHeight="251849216" behindDoc="0" locked="0" layoutInCell="1" allowOverlap="1" wp14:anchorId="0B712B2E" wp14:editId="3340F78C">
+          <wp:anchor distT="0" distB="0" distL="114300" distR="114300" simplePos="0" relativeHeight="251671040" behindDoc="0" locked="0" layoutInCell="1" allowOverlap="1" wp14:anchorId="0B712B2E" wp14:editId="3340F78C">
             <wp:simplePos x="0" y="0"/>
             <wp:positionH relativeFrom="column">
               <wp:posOffset>-527050</wp:posOffset>
@@ -8654,7 +8616,7 @@
           <w:noProof/>
         </w:rPr>
         <w:drawing>
-          <wp:anchor distT="0" distB="0" distL="114300" distR="114300" simplePos="0" relativeHeight="251852288" behindDoc="0" locked="0" layoutInCell="1" allowOverlap="1" wp14:anchorId="5D22A38B" wp14:editId="5E658369">
+          <wp:anchor distT="0" distB="0" distL="114300" distR="114300" simplePos="0" relativeHeight="251672064" behindDoc="0" locked="0" layoutInCell="1" allowOverlap="1" wp14:anchorId="5D22A38B" wp14:editId="5E658369">
             <wp:simplePos x="0" y="0"/>
             <wp:positionH relativeFrom="column">
               <wp:posOffset>-706640</wp:posOffset>
@@ -8910,7 +8872,7 @@
           <w:noProof/>
         </w:rPr>
         <w:drawing>
-          <wp:anchor distT="0" distB="0" distL="0" distR="0" simplePos="0" relativeHeight="251816448" behindDoc="0" locked="0" layoutInCell="0" allowOverlap="1" wp14:anchorId="4CBD6F33" wp14:editId="2377DE04">
+          <wp:anchor distT="0" distB="0" distL="0" distR="0" simplePos="0" relativeHeight="251667968" behindDoc="0" locked="0" layoutInCell="0" allowOverlap="1" wp14:anchorId="4CBD6F33" wp14:editId="2377DE04">
             <wp:simplePos x="0" y="0"/>
             <wp:positionH relativeFrom="column">
               <wp:posOffset>235470</wp:posOffset>
@@ -9228,53 +9190,39 @@
           <w:sz w:val="28"/>
           <w:szCs w:val="28"/>
         </w:rPr>
-        <w:t>2</w:t>
-      </w:r>
+        <w:t xml:space="preserve">2 </w:t>
+      </w:r>
+      <w:proofErr w:type="spellStart"/>
       <w:r>
         <w:rPr>
           <w:sz w:val="28"/>
           <w:szCs w:val="28"/>
         </w:rPr>
-        <w:t xml:space="preserve"> </w:t>
-      </w:r>
-      <w:proofErr w:type="spellStart"/>
+        <w:t>registr</w:t>
+      </w:r>
       <w:r>
         <w:rPr>
           <w:sz w:val="28"/>
           <w:szCs w:val="28"/>
         </w:rPr>
-        <w:t>registr</w:t>
-      </w:r>
+        <w:t>o</w:t>
+      </w:r>
+      <w:proofErr w:type="spellEnd"/>
       <w:r>
         <w:rPr>
           <w:sz w:val="28"/>
           <w:szCs w:val="28"/>
         </w:rPr>
-        <w:t>o</w:t>
-      </w:r>
-      <w:proofErr w:type="spellEnd"/>
-      <w:r>
+        <w:t xml:space="preserve"> -lo-fi </w:t>
+      </w:r>
+    </w:p>
+    <w:p>
+      <w:pPr>
+        <w:pStyle w:val="Textoindependiente"/>
         <w:rPr>
           <w:sz w:val="28"/>
           <w:szCs w:val="28"/>
         </w:rPr>
-        <w:t xml:space="preserve"> </w:t>
-      </w:r>
-      <w:r>
-        <w:rPr>
-          <w:sz w:val="28"/>
-          <w:szCs w:val="28"/>
-        </w:rPr>
-        <w:t xml:space="preserve">-lo-fi </w:t>
-      </w:r>
-    </w:p>
-    <w:p>
-      <w:pPr>
-        <w:pStyle w:val="Textoindependiente"/>
-        <w:rPr>
-          <w:sz w:val="28"/>
-          <w:szCs w:val="28"/>
-        </w:rPr>
       </w:pPr>
     </w:p>
     <w:p>
@@ -9293,7 +9241,7 @@
           <w:noProof/>
         </w:rPr>
         <w:drawing>
-          <wp:anchor distT="0" distB="0" distL="0" distR="0" simplePos="0" relativeHeight="251649536" behindDoc="0" locked="0" layoutInCell="0" allowOverlap="1" wp14:anchorId="66DC0CBE" wp14:editId="733FCC93">
+          <wp:anchor distT="0" distB="0" distL="0" distR="0" simplePos="0" relativeHeight="251650560" behindDoc="0" locked="0" layoutInCell="0" allowOverlap="1" wp14:anchorId="66DC0CBE" wp14:editId="733FCC93">
             <wp:simplePos x="0" y="0"/>
             <wp:positionH relativeFrom="column">
               <wp:posOffset>276860</wp:posOffset>
@@ -9631,44 +9579,30 @@
           <w:sz w:val="28"/>
           <w:szCs w:val="28"/>
         </w:rPr>
-        <w:t>3</w:t>
+        <w:t xml:space="preserve">3 </w:t>
       </w:r>
       <w:r>
         <w:rPr>
           <w:sz w:val="28"/>
           <w:szCs w:val="28"/>
         </w:rPr>
-        <w:t xml:space="preserve"> </w:t>
+        <w:t>Homepage</w:t>
       </w:r>
       <w:r>
         <w:rPr>
           <w:sz w:val="28"/>
           <w:szCs w:val="28"/>
         </w:rPr>
-        <w:t>Homepage</w:t>
-      </w:r>
-      <w:r>
+        <w:t xml:space="preserve"> lo-fi </w:t>
+      </w:r>
+    </w:p>
+    <w:p>
+      <w:pPr>
+        <w:pStyle w:val="Textoindependiente"/>
         <w:rPr>
           <w:sz w:val="28"/>
           <w:szCs w:val="28"/>
         </w:rPr>
-        <w:t xml:space="preserve"> </w:t>
-      </w:r>
-      <w:r>
-        <w:rPr>
-          <w:sz w:val="28"/>
-          <w:szCs w:val="28"/>
-        </w:rPr>
-        <w:t xml:space="preserve">lo-fi </w:t>
-      </w:r>
-    </w:p>
-    <w:p>
-      <w:pPr>
-        <w:pStyle w:val="Textoindependiente"/>
-        <w:rPr>
-          <w:sz w:val="28"/>
-          <w:szCs w:val="28"/>
-        </w:rPr>
       </w:pPr>
     </w:p>
     <w:p>
@@ -9687,7 +9621,7 @@
           <w:noProof/>
         </w:rPr>
         <w:drawing>
-          <wp:anchor distT="0" distB="0" distL="0" distR="0" simplePos="0" relativeHeight="251650560" behindDoc="0" locked="0" layoutInCell="0" allowOverlap="1" wp14:anchorId="4BF1CCED" wp14:editId="71982780">
+          <wp:anchor distT="0" distB="0" distL="0" distR="0" simplePos="0" relativeHeight="251651584" behindDoc="0" locked="0" layoutInCell="0" allowOverlap="1" wp14:anchorId="4BF1CCED" wp14:editId="71982780">
             <wp:simplePos x="0" y="0"/>
             <wp:positionH relativeFrom="column">
               <wp:posOffset>258330</wp:posOffset>
@@ -10051,7 +9985,6 @@
         <w:t xml:space="preserve"> del </w:t>
       </w:r>
       <w:proofErr w:type="spellStart"/>
-      <w:proofErr w:type="gramStart"/>
       <w:r>
         <w:rPr>
           <w:sz w:val="28"/>
@@ -10074,7 +10007,6 @@
         </w:rPr>
         <w:t xml:space="preserve"> lo</w:t>
       </w:r>
-      <w:proofErr w:type="gramEnd"/>
       <w:r>
         <w:rPr>
           <w:sz w:val="28"/>
@@ -10108,7 +10040,7 @@
           <w:noProof/>
         </w:rPr>
         <w:drawing>
-          <wp:anchor distT="0" distB="0" distL="0" distR="0" simplePos="0" relativeHeight="251652608" behindDoc="0" locked="0" layoutInCell="0" allowOverlap="1" wp14:anchorId="7FCF7755" wp14:editId="568752D5">
+          <wp:anchor distT="0" distB="0" distL="0" distR="0" simplePos="0" relativeHeight="251653632" behindDoc="0" locked="0" layoutInCell="0" allowOverlap="1" wp14:anchorId="7FCF7755" wp14:editId="568752D5">
             <wp:simplePos x="0" y="0"/>
             <wp:positionH relativeFrom="column">
               <wp:posOffset>262890</wp:posOffset>
@@ -10427,7 +10359,7 @@
         </w:rPr>
         <w:lastRenderedPageBreak/>
         <w:drawing>
-          <wp:anchor distT="0" distB="0" distL="0" distR="0" simplePos="0" relativeHeight="251660800" behindDoc="0" locked="0" layoutInCell="0" allowOverlap="1" wp14:anchorId="3E11BF4D" wp14:editId="4C9479ED">
+          <wp:anchor distT="0" distB="0" distL="0" distR="0" simplePos="0" relativeHeight="251657728" behindDoc="0" locked="0" layoutInCell="0" allowOverlap="1" wp14:anchorId="3E11BF4D" wp14:editId="4C9479ED">
             <wp:simplePos x="0" y="0"/>
             <wp:positionH relativeFrom="column">
               <wp:posOffset>3068320</wp:posOffset>
@@ -10486,7 +10418,7 @@
           <w:noProof/>
         </w:rPr>
         <w:drawing>
-          <wp:anchor distT="0" distB="0" distL="0" distR="0" simplePos="0" relativeHeight="251658752" behindDoc="0" locked="0" layoutInCell="0" allowOverlap="1" wp14:anchorId="5A090C30" wp14:editId="64104E60">
+          <wp:anchor distT="0" distB="0" distL="0" distR="0" simplePos="0" relativeHeight="251656704" behindDoc="0" locked="0" layoutInCell="0" allowOverlap="1" wp14:anchorId="5A090C30" wp14:editId="64104E60">
             <wp:simplePos x="0" y="0"/>
             <wp:positionH relativeFrom="column">
               <wp:posOffset>-644352</wp:posOffset>
@@ -10564,86 +10496,90 @@
           <w:sz w:val="28"/>
           <w:szCs w:val="28"/>
         </w:rPr>
-        <w:t>5</w:t>
-      </w:r>
+        <w:t xml:space="preserve">5 </w:t>
+      </w:r>
+      <w:proofErr w:type="spellStart"/>
       <w:r>
         <w:rPr>
           <w:sz w:val="28"/>
           <w:szCs w:val="28"/>
         </w:rPr>
-        <w:t xml:space="preserve"> </w:t>
-      </w:r>
-      <w:proofErr w:type="spellStart"/>
+        <w:t>crear</w:t>
+      </w:r>
+      <w:proofErr w:type="spellEnd"/>
       <w:r>
         <w:rPr>
           <w:sz w:val="28"/>
           <w:szCs w:val="28"/>
         </w:rPr>
-        <w:t>crear</w:t>
-      </w:r>
-      <w:proofErr w:type="spellEnd"/>
+        <w:t xml:space="preserve"> </w:t>
+      </w:r>
+      <w:proofErr w:type="spellStart"/>
       <w:r>
         <w:rPr>
           <w:sz w:val="28"/>
           <w:szCs w:val="28"/>
         </w:rPr>
-        <w:t xml:space="preserve"> </w:t>
-      </w:r>
-      <w:proofErr w:type="spellStart"/>
+        <w:t>actividades</w:t>
+      </w:r>
+      <w:proofErr w:type="spellEnd"/>
       <w:r>
         <w:rPr>
           <w:sz w:val="28"/>
           <w:szCs w:val="28"/>
         </w:rPr>
-        <w:t>actividades</w:t>
-      </w:r>
-      <w:proofErr w:type="spellEnd"/>
+        <w:t xml:space="preserve">, </w:t>
+      </w:r>
+      <w:proofErr w:type="spellStart"/>
       <w:r>
         <w:rPr>
           <w:sz w:val="28"/>
           <w:szCs w:val="28"/>
         </w:rPr>
-        <w:t xml:space="preserve">, </w:t>
-      </w:r>
-      <w:proofErr w:type="spellStart"/>
-      <w:proofErr w:type="gramStart"/>
+        <w:t>docente</w:t>
+      </w:r>
+      <w:proofErr w:type="spellEnd"/>
       <w:r>
         <w:rPr>
           <w:sz w:val="28"/>
           <w:szCs w:val="28"/>
         </w:rPr>
-        <w:t>docente</w:t>
-      </w:r>
-      <w:proofErr w:type="spellEnd"/>
+        <w:t xml:space="preserve"> </w:t>
+      </w:r>
       <w:r>
         <w:rPr>
           <w:sz w:val="28"/>
           <w:szCs w:val="28"/>
         </w:rPr>
-        <w:t xml:space="preserve"> </w:t>
-      </w:r>
-      <w:r>
+        <w:t xml:space="preserve"> lo-fi </w:t>
+      </w:r>
+    </w:p>
+    <w:p>
+      <w:pPr>
+        <w:pStyle w:val="Textoindependiente"/>
         <w:rPr>
           <w:sz w:val="28"/>
           <w:szCs w:val="28"/>
         </w:rPr>
-        <w:t xml:space="preserve"> </w:t>
-      </w:r>
-      <w:r>
+      </w:pPr>
+    </w:p>
+    <w:p>
+      <w:pPr>
+        <w:pStyle w:val="Textoindependiente"/>
         <w:rPr>
           <w:sz w:val="28"/>
           <w:szCs w:val="28"/>
         </w:rPr>
-        <w:t>lo</w:t>
-      </w:r>
-      <w:proofErr w:type="gramEnd"/>
-      <w:r>
+      </w:pPr>
+    </w:p>
+    <w:p>
+      <w:pPr>
+        <w:pStyle w:val="Textoindependiente"/>
         <w:rPr>
           <w:sz w:val="28"/>
           <w:szCs w:val="28"/>
         </w:rPr>
-        <w:t xml:space="preserve">-fi </w:t>
-      </w:r>
+      </w:pPr>
     </w:p>
     <w:p>
       <w:pPr>
@@ -10698,100 +10634,66 @@
           <w:szCs w:val="28"/>
         </w:rPr>
       </w:pPr>
-    </w:p>
-    <w:p>
-      <w:pPr>
-        <w:pStyle w:val="Textoindependiente"/>
+      <w:r>
         <w:rPr>
           <w:sz w:val="28"/>
           <w:szCs w:val="28"/>
         </w:rPr>
-      </w:pPr>
-    </w:p>
-    <w:p>
-      <w:pPr>
-        <w:pStyle w:val="Textoindependiente"/>
+        <w:lastRenderedPageBreak/>
+        <w:t>1</w:t>
+      </w:r>
+      <w:r>
         <w:rPr>
           <w:sz w:val="28"/>
           <w:szCs w:val="28"/>
         </w:rPr>
-      </w:pPr>
-    </w:p>
-    <w:p>
-      <w:pPr>
-        <w:pStyle w:val="Textoindependiente"/>
+        <w:t>1</w:t>
+      </w:r>
+      <w:r>
         <w:rPr>
           <w:sz w:val="28"/>
           <w:szCs w:val="28"/>
         </w:rPr>
-      </w:pPr>
+        <w:t>.</w:t>
+      </w:r>
       <w:r>
         <w:rPr>
           <w:sz w:val="28"/>
           <w:szCs w:val="28"/>
         </w:rPr>
-        <w:lastRenderedPageBreak/>
-        <w:t>1</w:t>
-      </w:r>
+        <w:t xml:space="preserve">6 Entregar </w:t>
+      </w:r>
+      <w:proofErr w:type="spellStart"/>
       <w:r>
         <w:rPr>
           <w:sz w:val="28"/>
           <w:szCs w:val="28"/>
         </w:rPr>
-        <w:t>1</w:t>
-      </w:r>
+        <w:t>actividades</w:t>
+      </w:r>
+      <w:proofErr w:type="spellEnd"/>
       <w:r>
         <w:rPr>
           <w:sz w:val="28"/>
           <w:szCs w:val="28"/>
         </w:rPr>
-        <w:t>.</w:t>
-      </w:r>
+        <w:t xml:space="preserve">, </w:t>
+      </w:r>
+      <w:proofErr w:type="spellStart"/>
       <w:r>
         <w:rPr>
           <w:sz w:val="28"/>
           <w:szCs w:val="28"/>
         </w:rPr>
-        <w:t xml:space="preserve">6 Entregar </w:t>
-      </w:r>
-      <w:proofErr w:type="spellStart"/>
+        <w:t>estudiante</w:t>
+      </w:r>
+      <w:proofErr w:type="spellEnd"/>
       <w:r>
         <w:rPr>
           <w:sz w:val="28"/>
           <w:szCs w:val="28"/>
         </w:rPr>
-        <w:t>actividades</w:t>
-      </w:r>
-      <w:proofErr w:type="spellEnd"/>
-      <w:r>
-        <w:rPr>
-          <w:sz w:val="28"/>
-          <w:szCs w:val="28"/>
-        </w:rPr>
-        <w:t xml:space="preserve">, </w:t>
-      </w:r>
-      <w:proofErr w:type="spellStart"/>
-      <w:r>
-        <w:rPr>
-          <w:sz w:val="28"/>
-          <w:szCs w:val="28"/>
-        </w:rPr>
-        <w:t>estudiante</w:t>
-      </w:r>
-      <w:proofErr w:type="spellEnd"/>
-      <w:r>
-        <w:rPr>
-          <w:sz w:val="28"/>
-          <w:szCs w:val="28"/>
-        </w:rPr>
-        <w:t xml:space="preserve"> lo</w:t>
-      </w:r>
-      <w:r>
-        <w:rPr>
-          <w:sz w:val="28"/>
-          <w:szCs w:val="28"/>
-        </w:rPr>
-        <w:t xml:space="preserve">-fi </w:t>
+        <w:t xml:space="preserve"> lo-fi </w:t>
       </w:r>
     </w:p>
     <w:p>
@@ -11164,41 +11066,23 @@
           <w:sz w:val="28"/>
           <w:szCs w:val="28"/>
         </w:rPr>
-        <w:t xml:space="preserve">, </w:t>
-      </w:r>
-      <w:proofErr w:type="spellStart"/>
-      <w:proofErr w:type="gramStart"/>
+        <w:t>, docente</w:t>
+      </w:r>
       <w:r>
         <w:rPr>
           <w:sz w:val="28"/>
           <w:szCs w:val="28"/>
         </w:rPr>
-        <w:t>docente</w:t>
-      </w:r>
-      <w:proofErr w:type="spellEnd"/>
-      <w:r>
+        <w:t xml:space="preserve">  lo-fi </w:t>
+      </w:r>
+    </w:p>
+    <w:p>
+      <w:pPr>
+        <w:pStyle w:val="Textoindependiente"/>
         <w:rPr>
           <w:sz w:val="28"/>
           <w:szCs w:val="28"/>
         </w:rPr>
-        <w:t xml:space="preserve">  lo</w:t>
-      </w:r>
-      <w:proofErr w:type="gramEnd"/>
-      <w:r>
-        <w:rPr>
-          <w:sz w:val="28"/>
-          <w:szCs w:val="28"/>
-        </w:rPr>
-        <w:t xml:space="preserve">-fi </w:t>
-      </w:r>
-    </w:p>
-    <w:p>
-      <w:pPr>
-        <w:pStyle w:val="Textoindependiente"/>
-        <w:rPr>
-          <w:sz w:val="28"/>
-          <w:szCs w:val="28"/>
-        </w:rPr>
       </w:pPr>
       <w:r>
         <w:rPr>
@@ -11207,7 +11091,7 @@
           <w:noProof/>
         </w:rPr>
         <w:drawing>
-          <wp:anchor distT="0" distB="0" distL="0" distR="0" simplePos="0" relativeHeight="251662848" behindDoc="0" locked="0" layoutInCell="0" allowOverlap="1" wp14:anchorId="44AF0FE5" wp14:editId="2F75877B">
+          <wp:anchor distT="0" distB="0" distL="0" distR="0" simplePos="0" relativeHeight="251658752" behindDoc="0" locked="0" layoutInCell="0" allowOverlap="1" wp14:anchorId="44AF0FE5" wp14:editId="2F75877B">
             <wp:simplePos x="0" y="0"/>
             <wp:positionH relativeFrom="column">
               <wp:posOffset>-595110</wp:posOffset>
@@ -11275,7 +11159,7 @@
           <w:noProof/>
         </w:rPr>
         <w:drawing>
-          <wp:anchor distT="0" distB="0" distL="0" distR="0" simplePos="0" relativeHeight="251664896" behindDoc="0" locked="0" layoutInCell="0" allowOverlap="1" wp14:anchorId="7CEA9B9F" wp14:editId="5879ABDF">
+          <wp:anchor distT="0" distB="0" distL="0" distR="0" simplePos="0" relativeHeight="251659776" behindDoc="0" locked="0" layoutInCell="0" allowOverlap="1" wp14:anchorId="7CEA9B9F" wp14:editId="5879ABDF">
             <wp:simplePos x="0" y="0"/>
             <wp:positionH relativeFrom="column">
               <wp:posOffset>240665</wp:posOffset>
@@ -11621,53 +11505,39 @@
           <w:sz w:val="28"/>
           <w:szCs w:val="28"/>
         </w:rPr>
-        <w:t>8</w:t>
-      </w:r>
+        <w:t xml:space="preserve">8 </w:t>
+      </w:r>
+      <w:proofErr w:type="spellStart"/>
       <w:r>
         <w:rPr>
           <w:sz w:val="28"/>
           <w:szCs w:val="28"/>
         </w:rPr>
-        <w:t xml:space="preserve"> </w:t>
-      </w:r>
-      <w:proofErr w:type="spellStart"/>
+        <w:t>Edicion</w:t>
+      </w:r>
+      <w:proofErr w:type="spellEnd"/>
       <w:r>
         <w:rPr>
           <w:sz w:val="28"/>
           <w:szCs w:val="28"/>
         </w:rPr>
-        <w:t>Edicion</w:t>
-      </w:r>
-      <w:proofErr w:type="spellEnd"/>
+        <w:t xml:space="preserve"> de </w:t>
+      </w:r>
+      <w:proofErr w:type="spellStart"/>
       <w:r>
         <w:rPr>
           <w:sz w:val="28"/>
           <w:szCs w:val="28"/>
         </w:rPr>
-        <w:t xml:space="preserve"> de </w:t>
-      </w:r>
-      <w:proofErr w:type="spellStart"/>
+        <w:t>datos</w:t>
+      </w:r>
+      <w:proofErr w:type="spellEnd"/>
       <w:r>
         <w:rPr>
           <w:sz w:val="28"/>
           <w:szCs w:val="28"/>
         </w:rPr>
-        <w:t>datos</w:t>
-      </w:r>
-      <w:proofErr w:type="spellEnd"/>
-      <w:r>
-        <w:rPr>
-          <w:sz w:val="28"/>
-          <w:szCs w:val="28"/>
-        </w:rPr>
-        <w:t xml:space="preserve">, de </w:t>
-      </w:r>
-      <w:r>
-        <w:rPr>
-          <w:sz w:val="28"/>
-          <w:szCs w:val="28"/>
-        </w:rPr>
-        <w:t xml:space="preserve">  lo-fi </w:t>
+        <w:t xml:space="preserve">, de   lo-fi </w:t>
       </w:r>
     </w:p>
     <w:p>
@@ -11686,7 +11556,7 @@
           <w:noProof/>
         </w:rPr>
         <w:drawing>
-          <wp:anchor distT="0" distB="0" distL="0" distR="0" simplePos="0" relativeHeight="251656704" behindDoc="0" locked="0" layoutInCell="0" allowOverlap="1" wp14:anchorId="68CB89CF" wp14:editId="36ADE4E5">
+          <wp:anchor distT="0" distB="0" distL="0" distR="0" simplePos="0" relativeHeight="251655680" behindDoc="0" locked="0" layoutInCell="0" allowOverlap="1" wp14:anchorId="68CB89CF" wp14:editId="36ADE4E5">
             <wp:simplePos x="0" y="0"/>
             <wp:positionH relativeFrom="column">
               <wp:posOffset>3027045</wp:posOffset>
@@ -11745,7 +11615,7 @@
           <w:noProof/>
         </w:rPr>
         <w:drawing>
-          <wp:anchor distT="0" distB="0" distL="0" distR="0" simplePos="0" relativeHeight="251666944" behindDoc="0" locked="0" layoutInCell="0" allowOverlap="1" wp14:anchorId="55EDA389" wp14:editId="3ACE9D5D">
+          <wp:anchor distT="0" distB="0" distL="0" distR="0" simplePos="0" relativeHeight="251660800" behindDoc="0" locked="0" layoutInCell="0" allowOverlap="1" wp14:anchorId="55EDA389" wp14:editId="3ACE9D5D">
             <wp:simplePos x="0" y="0"/>
             <wp:positionH relativeFrom="column">
               <wp:posOffset>-411018</wp:posOffset>
@@ -12111,7 +11981,7 @@
         <w:noProof/>
       </w:rPr>
       <w:pict w14:anchorId="3D66317A">
-        <v:rect id="Marco2" o:spid="_x0000_s1026" style="position:absolute;margin-left:-50.05pt;margin-top:.05pt;width:1.15pt;height:1.15pt;z-index:-503316476;visibility:visible;mso-wrap-style:square;mso-wrap-distance-left:0;mso-wrap-distance-top:0;mso-wrap-distance-right:0;mso-wrap-distance-bottom:0;mso-position-horizontal:right;mso-position-horizontal-relative:margin;mso-position-vertical:absolute;mso-position-vertical-relative:text;v-text-anchor:top" o:gfxdata="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" o:allowincell="f" filled="f" stroked="f" strokeweight="0">
+        <v:rect id="Marco2" o:spid="_x0000_s1026" style="position:absolute;margin-left:-100.1pt;margin-top:.05pt;width:1.15pt;height:1.15pt;z-index:-503316476;visibility:visible;mso-wrap-style:square;mso-wrap-distance-left:0;mso-wrap-distance-top:0;mso-wrap-distance-right:0;mso-wrap-distance-bottom:0;mso-position-horizontal:right;mso-position-horizontal-relative:margin;mso-position-vertical:absolute;mso-position-vertical-relative:text;v-text-anchor:top" o:gfxdata="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" o:allowincell="f" filled="f" stroked="f" strokeweight="0">
           <v:textbox style="mso-fit-shape-to-text:t" inset="0,0,0,0">
             <w:txbxContent>
               <w:p>
@@ -12182,7 +12052,7 @@
         <w:noProof/>
       </w:rPr>
       <w:pict w14:anchorId="401194E1">
-        <v:rect id="Marco3" o:spid="_x0000_s1025" style="position:absolute;left:0;text-align:left;margin-left:-45.15pt;margin-top:.05pt;width:6.05pt;height:27.5pt;z-index:-503316433;visibility:visible;mso-wrap-style:square;mso-wrap-distance-left:0;mso-wrap-distance-top:0;mso-wrap-distance-right:0;mso-wrap-distance-bottom:0;mso-position-horizontal:right;mso-position-horizontal-relative:margin;mso-position-vertical:absolute;mso-position-vertical-relative:text;v-text-anchor:top" o:gfxdata="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" o:allowincell="f" filled="f" stroked="f" strokeweight="0">
+        <v:rect id="Marco3" o:spid="_x0000_s1025" style="position:absolute;left:0;text-align:left;margin-left:-90.3pt;margin-top:.05pt;width:6.05pt;height:27.5pt;z-index:-503316433;visibility:visible;mso-wrap-style:square;mso-wrap-distance-left:0;mso-wrap-distance-top:0;mso-wrap-distance-right:0;mso-wrap-distance-bottom:0;mso-position-horizontal:right;mso-position-horizontal-relative:margin;mso-position-vertical:absolute;mso-position-vertical-relative:text;v-text-anchor:top" o:gfxdata="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" o:allowincell="f" filled="f" stroked="f" strokeweight="0">
           <v:textbox style="mso-fit-shape-to-text:t" inset="0,0,0,0">
             <w:txbxContent>
               <w:p>
@@ -14006,6 +13876,7 @@
   <w:style w:type="character" w:default="1" w:styleId="Fuentedeprrafopredeter">
     <w:name w:val="Default Paragraph Font"/>
     <w:uiPriority w:val="1"/>
+    <w:semiHidden/>
     <w:unhideWhenUsed/>
   </w:style>
   <w:style w:type="table" w:default="1" w:styleId="Tablanormal">

</xml_diff>